<commit_message>
TS 2.2 Jatai Ghanam final 31/07/2026
</commit_message>
<xml_diff>
--- a/TS Jatai Ghanam Project/TS 2.2/TS 2.2 Jatai Tamil Corrections.docx
+++ b/TS Jatai Ghanam Project/TS 2.2/TS 2.2 Jatai Tamil Corrections.docx
@@ -1,6 +1,6 @@
 
 <file path=word/document.xml><?xml version="1.0" encoding="utf-8"?>
-<w:document xmlns:wpc="http://schemas.microsoft.com/office/word/2010/wordprocessingCanvas" xmlns:cx="http://schemas.microsoft.com/office/drawing/2014/chartex" xmlns:cx1="http://schemas.microsoft.com/office/drawing/2015/9/8/chartex" xmlns:cx2="http://schemas.microsoft.com/office/drawing/2015/10/21/chartex" xmlns:cx3="http://schemas.microsoft.com/office/drawing/2016/5/9/chartex" xmlns:cx4="http://schemas.microsoft.com/office/drawing/2016/5/10/chartex" xmlns:cx5="http://schemas.microsoft.com/office/drawing/2016/5/11/chartex" xmlns:cx6="http://schemas.microsoft.com/office/drawing/2016/5/12/chartex" xmlns:cx7="http://schemas.microsoft.com/office/drawing/2016/5/13/chartex" xmlns:cx8="http://schemas.microsoft.com/office/drawing/2016/5/14/chartex" xmlns:mc="http://schemas.openxmlformats.org/markup-compatibility/2006" xmlns:aink="http://schemas.microsoft.com/office/drawing/2016/ink" xmlns:am3d="http://schemas.microsoft.com/office/drawing/2017/model3d" xmlns:o="urn:schemas-microsoft-com:office:office" xmlns:oel="http://schemas.microsoft.com/office/2019/extlst" xmlns:r="http://schemas.openxmlformats.org/officeDocument/2006/relationships" xmlns:m="http://schemas.openxmlformats.org/officeDocument/2006/math" xmlns:v="urn:schemas-microsoft-com:vml" xmlns:wp14="http://schemas.microsoft.com/office/word/2010/wordprocessingDrawing" xmlns:wp="http://schemas.openxmlformats.org/drawingml/2006/wordprocessingDrawing" xmlns:w10="urn:schemas-microsoft-com:office:word" xmlns:w="http://schemas.openxmlformats.org/wordprocessingml/2006/main" xmlns:w14="http://schemas.microsoft.com/office/word/2010/wordml" xmlns:w15="http://schemas.microsoft.com/office/word/2012/wordml" xmlns:w16cex="http://schemas.microsoft.com/office/word/2018/wordml/cex" xmlns:w16cid="http://schemas.microsoft.com/office/word/2016/wordml/cid" xmlns:w16="http://schemas.microsoft.com/office/word/2018/wordml" xmlns:w16du="http://schemas.microsoft.com/office/word/2023/wordml/word16du" xmlns:w16sdtdh="http://schemas.microsoft.com/office/word/2020/wordml/sdtdatahash" xmlns:w16sdtfl="http://schemas.microsoft.com/office/word/2024/wordml/sdtformatlock" xmlns:w16se="http://schemas.microsoft.com/office/word/2015/wordml/symex" xmlns:wpg="http://schemas.microsoft.com/office/word/2010/wordprocessingGroup" xmlns:wpi="http://schemas.microsoft.com/office/word/2010/wordprocessingInk" xmlns:wne="http://schemas.microsoft.com/office/word/2006/wordml" xmlns:wps="http://schemas.microsoft.com/office/word/2010/wordprocessingShape" mc:Ignorable="w14 w15 w16se w16cid w16 w16cex w16sdtdh w16sdtfl w16du wp14">
+<w:document xmlns:wpc="http://schemas.microsoft.com/office/word/2010/wordprocessingCanvas" xmlns:cx="http://schemas.microsoft.com/office/drawing/2014/chartex" xmlns:cx1="http://schemas.microsoft.com/office/drawing/2015/9/8/chartex" xmlns:cx2="http://schemas.microsoft.com/office/drawing/2015/10/21/chartex" xmlns:cx3="http://schemas.microsoft.com/office/drawing/2016/5/9/chartex" xmlns:cx4="http://schemas.microsoft.com/office/drawing/2016/5/10/chartex" xmlns:cx5="http://schemas.microsoft.com/office/drawing/2016/5/11/chartex" xmlns:cx6="http://schemas.microsoft.com/office/drawing/2016/5/12/chartex" xmlns:cx7="http://schemas.microsoft.com/office/drawing/2016/5/13/chartex" xmlns:cx8="http://schemas.microsoft.com/office/drawing/2016/5/14/chartex" xmlns:mc="http://schemas.openxmlformats.org/markup-compatibility/2006" xmlns:aink="http://schemas.microsoft.com/office/drawing/2016/ink" xmlns:am3d="http://schemas.microsoft.com/office/drawing/2017/model3d" xmlns:o="urn:schemas-microsoft-com:office:office" xmlns:oel="http://schemas.microsoft.com/office/2019/extlst" xmlns:r="http://schemas.openxmlformats.org/officeDocument/2006/relationships" xmlns:m="http://schemas.openxmlformats.org/officeDocument/2006/math" xmlns:v="urn:schemas-microsoft-com:vml" xmlns:wp14="http://schemas.microsoft.com/office/word/2010/wordprocessingDrawing" xmlns:wp="http://schemas.openxmlformats.org/drawingml/2006/wordprocessingDrawing" xmlns:w10="urn:schemas-microsoft-com:office:word" xmlns:w="http://schemas.openxmlformats.org/wordprocessingml/2006/main" xmlns:w14="http://schemas.microsoft.com/office/word/2010/wordml" xmlns:w15="http://schemas.microsoft.com/office/word/2012/wordml" xmlns:w16cei="http://schemas.microsoft.com/office/word/2026/wordml/cei" xmlns:w16cex="http://schemas.microsoft.com/office/word/2018/wordml/cex" xmlns:w16cid="http://schemas.microsoft.com/office/word/2016/wordml/cid" xmlns:w16="http://schemas.microsoft.com/office/word/2018/wordml" xmlns:w16du="http://schemas.microsoft.com/office/word/2023/wordml/word16du" xmlns:w16sdtdh="http://schemas.microsoft.com/office/word/2020/wordml/sdtdatahash" xmlns:w16sdtfl="http://schemas.microsoft.com/office/word/2024/wordml/sdtformatlock" xmlns:w16se="http://schemas.microsoft.com/office/word/2015/wordml/symex" xmlns:wpg="http://schemas.microsoft.com/office/word/2010/wordprocessingGroup" xmlns:wpi="http://schemas.microsoft.com/office/word/2010/wordprocessingInk" xmlns:wne="http://schemas.microsoft.com/office/word/2006/wordml" xmlns:wps="http://schemas.microsoft.com/office/word/2010/wordprocessingShape" mc:Ignorable="w14 w15 w16se w16cid w16 w16cex w16sdtdh w16sdtfl w16du wp14">
   <w:body>
     <w:p>
       <w:pPr>
@@ -203,6 +203,221 @@
           </w:tcPr>
           <w:p>
             <w:pPr>
+              <w:autoSpaceDE w:val="0"/>
+              <w:autoSpaceDN w:val="0"/>
+              <w:adjustRightInd w:val="0"/>
+              <w:rPr>
+                <w:rFonts w:ascii="Latha" w:hAnsi="Latha" w:cs="Latha"/>
+                <w:szCs w:val="24"/>
+                <w:lang w:bidi="ta-IN"/>
+              </w:rPr>
+            </w:pPr>
+            <w:r>
+              <w:rPr>
+                <w:rFonts w:cs="Latha"/>
+                <w:b/>
+                <w:bCs/>
+                <w:szCs w:val="24"/>
+                <w:cs/>
+                <w:lang w:bidi="ta-IN"/>
+              </w:rPr>
+              <w:t>49</w:t>
+            </w:r>
+            <w:r>
+              <w:rPr>
+                <w:rFonts w:ascii="Latha" w:hAnsi="Latha" w:cs="Latha"/>
+                <w:b/>
+                <w:bCs/>
+                <w:szCs w:val="24"/>
+                <w:lang w:bidi="ta-IN"/>
+              </w:rPr>
+              <w:t>)</w:t>
+            </w:r>
+            <w:r>
+              <w:rPr>
+                <w:rFonts w:ascii="Latha" w:hAnsi="Latha" w:cs="Latha"/>
+                <w:szCs w:val="24"/>
+                <w:lang w:bidi="ta-IN"/>
+              </w:rPr>
+              <w:tab/>
+            </w:r>
+            <w:r>
+              <w:rPr>
+                <w:rFonts w:cs="Latha"/>
+                <w:b/>
+                <w:bCs/>
+                <w:szCs w:val="24"/>
+                <w:cs/>
+                <w:lang w:bidi="ta-IN"/>
+              </w:rPr>
+              <w:t>2.2</w:t>
+            </w:r>
+            <w:r>
+              <w:rPr>
+                <w:rFonts w:cs="Latha"/>
+                <w:b/>
+                <w:bCs/>
+                <w:szCs w:val="24"/>
+                <w:lang w:bidi="ta-IN"/>
+              </w:rPr>
+              <w:t>.12.</w:t>
+            </w:r>
+            <w:r>
+              <w:rPr>
+                <w:rFonts w:cs="Latha"/>
+                <w:b/>
+                <w:bCs/>
+                <w:szCs w:val="24"/>
+                <w:cs/>
+                <w:lang w:bidi="ta-IN"/>
+              </w:rPr>
+              <w:t>1</w:t>
+            </w:r>
+            <w:r>
+              <w:rPr>
+                <w:rFonts w:ascii="Latha" w:hAnsi="Latha" w:cs="Latha"/>
+                <w:b/>
+                <w:bCs/>
+                <w:szCs w:val="24"/>
+                <w:lang w:bidi="ta-IN"/>
+              </w:rPr>
+              <w:t>(</w:t>
+            </w:r>
+            <w:r>
+              <w:rPr>
+                <w:rFonts w:cs="Latha"/>
+                <w:b/>
+                <w:bCs/>
+                <w:szCs w:val="24"/>
+                <w:cs/>
+                <w:lang w:bidi="ta-IN"/>
+              </w:rPr>
+              <w:t>47</w:t>
+            </w:r>
+            <w:r>
+              <w:rPr>
+                <w:rFonts w:ascii="Latha" w:hAnsi="Latha" w:cs="Latha"/>
+                <w:b/>
+                <w:bCs/>
+                <w:szCs w:val="24"/>
+                <w:lang w:bidi="ta-IN"/>
+              </w:rPr>
+              <w:t>)</w:t>
+            </w:r>
+            <w:r>
+              <w:rPr>
+                <w:rFonts w:ascii="Latha" w:hAnsi="Latha" w:cs="Latha"/>
+                <w:szCs w:val="24"/>
+                <w:lang w:bidi="ta-IN"/>
+              </w:rPr>
+              <w:t xml:space="preserve">-  </w:t>
+            </w:r>
+            <w:r>
+              <w:rPr>
+                <w:rFonts w:ascii="Latha" w:hAnsi="Latha" w:cs="Latha"/>
+                <w:szCs w:val="24"/>
+                <w:cs/>
+                <w:lang w:bidi="ta-IN"/>
+              </w:rPr>
+              <w:t>ஶஶ்வ</w:t>
+            </w:r>
+            <w:r>
+              <w:rPr>
+                <w:rFonts w:ascii="BRH Tamil Tab Extra" w:hAnsi="BRH Tamil Tab Extra" w:cs="Latha"/>
+                <w:b/>
+                <w:bCs/>
+                <w:szCs w:val="28"/>
+                <w:lang w:bidi="ta-IN"/>
+              </w:rPr>
+              <w:t>†</w:t>
+            </w:r>
+            <w:r>
+              <w:rPr>
+                <w:rFonts w:ascii="Latha" w:hAnsi="Latha" w:cs="Latha"/>
+                <w:szCs w:val="24"/>
+                <w:cs/>
+                <w:lang w:bidi="ta-IN"/>
+              </w:rPr>
+              <w:t>த</w:t>
+            </w:r>
+            <w:r>
+              <w:rPr>
+                <w:rFonts w:ascii="Latha" w:hAnsi="Latha" w:cs="Latha"/>
+                <w:b/>
+                <w:bCs/>
+                <w:szCs w:val="24"/>
+                <w:cs/>
+                <w:lang w:bidi="ta-IN"/>
+              </w:rPr>
+              <w:t>:</w:t>
+            </w:r>
+            <w:r>
+              <w:rPr>
+                <w:rFonts w:ascii="Latha" w:hAnsi="Latha" w:cs="Latha"/>
+                <w:szCs w:val="24"/>
+                <w:cs/>
+                <w:lang w:bidi="ta-IN"/>
+              </w:rPr>
+              <w:t xml:space="preserve"> </w:t>
+            </w:r>
+            <w:r>
+              <w:rPr>
+                <w:rFonts w:ascii="Latha" w:hAnsi="Latha" w:cs="Latha"/>
+                <w:szCs w:val="24"/>
+                <w:lang w:bidi="ta-IN"/>
+              </w:rPr>
+              <w:t xml:space="preserve">| </w:t>
+            </w:r>
+            <w:r>
+              <w:rPr>
+                <w:rFonts w:ascii="Latha" w:hAnsi="Latha" w:cs="Latha"/>
+                <w:szCs w:val="24"/>
+                <w:cs/>
+                <w:lang w:bidi="ta-IN"/>
+              </w:rPr>
+              <w:t>க</w:t>
+            </w:r>
+            <w:r>
+              <w:rPr>
+                <w:rFonts w:ascii="BRH Tamil Tab Extra" w:hAnsi="BRH Tamil Tab Extra" w:cs="Latha"/>
+                <w:b/>
+                <w:bCs/>
+                <w:szCs w:val="28"/>
+                <w:lang w:bidi="ta-IN"/>
+              </w:rPr>
+              <w:t>…</w:t>
+            </w:r>
+            <w:r>
+              <w:rPr>
+                <w:rFonts w:ascii="Latha" w:hAnsi="Latha" w:cs="Latha"/>
+                <w:b/>
+                <w:bCs/>
+                <w:szCs w:val="24"/>
+                <w:cs/>
+                <w:lang w:bidi="ta-IN"/>
+              </w:rPr>
+              <w:t>:</w:t>
+            </w:r>
+            <w:r>
+              <w:rPr>
+                <w:rFonts w:ascii="Latha" w:hAnsi="Latha" w:cs="Latha"/>
+                <w:szCs w:val="24"/>
+                <w:cs/>
+                <w:lang w:bidi="ta-IN"/>
+              </w:rPr>
+              <w:t xml:space="preserve"> </w:t>
+            </w:r>
+            <w:r>
+              <w:rPr>
+                <w:rFonts w:ascii="Latha" w:hAnsi="Latha" w:cs="Latha"/>
+                <w:szCs w:val="24"/>
+                <w:lang w:bidi="ta-IN"/>
+              </w:rPr>
+              <w:t xml:space="preserve">| </w:t>
+            </w:r>
+          </w:p>
+          <w:p>
+            <w:pPr>
               <w:widowControl w:val="0"/>
               <w:autoSpaceDE w:val="0"/>
               <w:autoSpaceDN w:val="0"/>
@@ -218,13 +433,243 @@
             </w:pPr>
             <w:r>
               <w:rPr>
+                <w:rFonts w:ascii="Latha" w:hAnsi="Latha" w:cs="Latha"/>
+                <w:szCs w:val="24"/>
+                <w:cs/>
+                <w:lang w:bidi="ta-IN"/>
+              </w:rPr>
+              <w:t>ஶஶ்வ</w:t>
+            </w:r>
+            <w:r>
+              <w:rPr>
+                <w:rFonts w:ascii="BRH Tamil Tab Extra" w:hAnsi="BRH Tamil Tab Extra" w:cs="Latha"/>
+                <w:b/>
+                <w:bCs/>
+                <w:szCs w:val="28"/>
+                <w:highlight w:val="yellow"/>
+                <w:lang w:bidi="ta-IN"/>
+              </w:rPr>
+              <w:t>†</w:t>
+            </w:r>
+            <w:r>
+              <w:rPr>
+                <w:rFonts w:ascii="Latha" w:hAnsi="Latha" w:cs="Latha"/>
+                <w:color w:val="EE0000"/>
+                <w:szCs w:val="24"/>
+                <w:highlight w:val="yellow"/>
+                <w:cs/>
+                <w:lang w:bidi="ta-IN"/>
+              </w:rPr>
+              <w:t>த</w:t>
+            </w:r>
+            <w:r>
+              <w:rPr>
+                <w:rFonts w:ascii="Latha" w:hAnsi="Latha" w:cs="Latha"/>
+                <w:b/>
+                <w:bCs/>
+                <w:color w:val="EE0000"/>
+                <w:szCs w:val="24"/>
+                <w:highlight w:val="yellow"/>
+                <w:cs/>
+                <w:lang w:bidi="ta-IN"/>
+              </w:rPr>
+              <w:t>:</w:t>
+            </w:r>
+            <w:r>
+              <w:rPr>
+                <w:rFonts w:ascii="Latha" w:hAnsi="Latha" w:cs="Latha"/>
+                <w:color w:val="EE0000"/>
+                <w:szCs w:val="24"/>
+                <w:highlight w:val="yellow"/>
+                <w:cs/>
+                <w:lang w:bidi="ta-IN"/>
+              </w:rPr>
+              <w:t xml:space="preserve"> க</w:t>
+            </w:r>
+            <w:r>
+              <w:rPr>
+                <w:rFonts w:ascii="Latha" w:hAnsi="Latha" w:cs="Latha"/>
+                <w:b/>
+                <w:bCs/>
+                <w:color w:val="EE0000"/>
+                <w:szCs w:val="24"/>
+                <w:cs/>
+                <w:lang w:bidi="ta-IN"/>
+              </w:rPr>
+              <w:t>:</w:t>
+            </w:r>
+            <w:r>
+              <w:rPr>
+                <w:rFonts w:ascii="Latha" w:hAnsi="Latha" w:cs="Latha"/>
+                <w:szCs w:val="24"/>
+                <w:cs/>
+                <w:lang w:bidi="ta-IN"/>
+              </w:rPr>
+              <w:t xml:space="preserve"> க</w:t>
+            </w:r>
+            <w:r>
+              <w:rPr>
+                <w:rFonts w:ascii="BRH Tamil Tab Extra" w:hAnsi="BRH Tamil Tab Extra" w:cs="Latha"/>
+                <w:b/>
+                <w:bCs/>
+                <w:szCs w:val="28"/>
+                <w:lang w:bidi="ta-IN"/>
+              </w:rPr>
+              <w:t>…</w:t>
+            </w:r>
+            <w:r>
+              <w:rPr>
+                <w:rFonts w:ascii="Latha" w:hAnsi="Latha" w:cs="Latha"/>
+                <w:b/>
+                <w:bCs/>
+                <w:szCs w:val="24"/>
+                <w:cs/>
+                <w:lang w:bidi="ta-IN"/>
+              </w:rPr>
+              <w:t>:</w:t>
+            </w:r>
+            <w:r>
+              <w:rPr>
+                <w:rFonts w:ascii="Latha" w:hAnsi="Latha" w:cs="Latha"/>
+                <w:szCs w:val="24"/>
+                <w:cs/>
+                <w:lang w:bidi="ta-IN"/>
+              </w:rPr>
+              <w:t xml:space="preserve"> ஶஶ்வ</w:t>
+            </w:r>
+            <w:r>
+              <w:rPr>
+                <w:rFonts w:ascii="BRH Tamil Tab Extra" w:hAnsi="BRH Tamil Tab Extra" w:cs="Latha"/>
+                <w:b/>
+                <w:bCs/>
+                <w:szCs w:val="28"/>
+                <w:lang w:bidi="ta-IN"/>
+              </w:rPr>
+              <w:t>†</w:t>
+            </w:r>
+            <w:r>
+              <w:rPr>
+                <w:rFonts w:ascii="Latha" w:hAnsi="Latha" w:cs="Latha"/>
+                <w:szCs w:val="24"/>
+                <w:cs/>
+                <w:lang w:bidi="ta-IN"/>
+              </w:rPr>
+              <w:t>த</w:t>
+            </w:r>
+            <w:r>
+              <w:rPr>
+                <w:rFonts w:ascii="BRH Tamil Tab Extra" w:hAnsi="BRH Tamil Tab Extra" w:cs="Latha"/>
+                <w:b/>
+                <w:bCs/>
+                <w:szCs w:val="28"/>
+                <w:lang w:bidi="ta-IN"/>
+              </w:rPr>
+              <w:t>…</w:t>
+            </w:r>
+            <w:r>
+              <w:rPr>
+                <w:rFonts w:ascii="Latha" w:hAnsi="Latha" w:cs="Latha"/>
+                <w:b/>
+                <w:bCs/>
+                <w:szCs w:val="24"/>
+                <w:cs/>
+                <w:lang w:bidi="ta-IN"/>
+              </w:rPr>
+              <w:t>:</w:t>
+            </w:r>
+            <w:r>
+              <w:rPr>
+                <w:rFonts w:ascii="Latha" w:hAnsi="Latha" w:cs="Latha"/>
+                <w:szCs w:val="24"/>
+                <w:cs/>
+                <w:lang w:bidi="ta-IN"/>
+              </w:rPr>
+              <w:t xml:space="preserve"> ஶஶ்வ</w:t>
+            </w:r>
+            <w:r>
+              <w:rPr>
+                <w:rFonts w:ascii="BRH Tamil Tab Extra" w:hAnsi="BRH Tamil Tab Extra" w:cs="Latha"/>
+                <w:b/>
+                <w:bCs/>
+                <w:szCs w:val="28"/>
+                <w:lang w:bidi="ta-IN"/>
+              </w:rPr>
+              <w:t>†</w:t>
+            </w:r>
+            <w:r>
+              <w:rPr>
+                <w:rFonts w:ascii="Latha" w:hAnsi="Latha" w:cs="Latha"/>
+                <w:color w:val="EE0000"/>
+                <w:szCs w:val="24"/>
+                <w:highlight w:val="yellow"/>
+                <w:cs/>
+                <w:lang w:bidi="ta-IN"/>
+              </w:rPr>
+              <w:t>த</w:t>
+            </w:r>
+            <w:r>
+              <w:rPr>
+                <w:rFonts w:ascii="Latha" w:hAnsi="Latha" w:cs="Latha"/>
+                <w:b/>
+                <w:bCs/>
+                <w:color w:val="EE0000"/>
+                <w:szCs w:val="24"/>
+                <w:highlight w:val="yellow"/>
+                <w:cs/>
+                <w:lang w:bidi="ta-IN"/>
+              </w:rPr>
+              <w:t>:</w:t>
+            </w:r>
+            <w:r>
+              <w:rPr>
+                <w:rFonts w:ascii="Latha" w:hAnsi="Latha" w:cs="Latha"/>
+                <w:color w:val="EE0000"/>
+                <w:szCs w:val="24"/>
+                <w:highlight w:val="yellow"/>
+                <w:cs/>
+                <w:lang w:bidi="ta-IN"/>
+              </w:rPr>
+              <w:t xml:space="preserve"> க</w:t>
+            </w:r>
+            <w:r>
+              <w:rPr>
+                <w:rFonts w:ascii="Latha" w:hAnsi="Latha" w:cs="Latha"/>
+                <w:b/>
+                <w:bCs/>
+                <w:color w:val="EE0000"/>
+                <w:szCs w:val="24"/>
+                <w:highlight w:val="yellow"/>
+                <w:cs/>
+                <w:lang w:bidi="ta-IN"/>
+              </w:rPr>
+              <w:t>:</w:t>
+            </w:r>
+            <w:r>
+              <w:rPr>
+                <w:rFonts w:ascii="Latha" w:hAnsi="Latha" w:cs="Latha"/>
+                <w:szCs w:val="24"/>
+                <w:cs/>
+                <w:lang w:bidi="ta-IN"/>
+              </w:rPr>
+              <w:t xml:space="preserve"> </w:t>
+            </w:r>
+            <w:r>
+              <w:rPr>
+                <w:rFonts w:ascii="Latha" w:hAnsi="Latha" w:cs="Latha"/>
+                <w:szCs w:val="24"/>
+                <w:lang w:bidi="ta-IN"/>
+              </w:rPr>
+              <w:t>|</w:t>
+            </w:r>
+            <w:r>
+              <w:rPr>
                 <w:rFonts w:cs="BRH Malayalam Extra"/>
                 <w:b/>
                 <w:bCs/>
                 <w:color w:val="000000"/>
                 <w:szCs w:val="40"/>
               </w:rPr>
-              <w:t>None           None        None                    None</w:t>
+              <w:t xml:space="preserve">      </w:t>
             </w:r>
           </w:p>
         </w:tc>
@@ -234,6 +679,221 @@
           </w:tcPr>
           <w:p>
             <w:pPr>
+              <w:autoSpaceDE w:val="0"/>
+              <w:autoSpaceDN w:val="0"/>
+              <w:adjustRightInd w:val="0"/>
+              <w:rPr>
+                <w:rFonts w:ascii="Latha" w:hAnsi="Latha" w:cs="Latha"/>
+                <w:szCs w:val="24"/>
+                <w:lang w:bidi="ta-IN"/>
+              </w:rPr>
+            </w:pPr>
+            <w:r>
+              <w:rPr>
+                <w:rFonts w:cs="Latha"/>
+                <w:b/>
+                <w:bCs/>
+                <w:szCs w:val="24"/>
+                <w:cs/>
+                <w:lang w:bidi="ta-IN"/>
+              </w:rPr>
+              <w:t>49</w:t>
+            </w:r>
+            <w:r>
+              <w:rPr>
+                <w:rFonts w:ascii="Latha" w:hAnsi="Latha" w:cs="Latha"/>
+                <w:b/>
+                <w:bCs/>
+                <w:szCs w:val="24"/>
+                <w:lang w:bidi="ta-IN"/>
+              </w:rPr>
+              <w:t>)</w:t>
+            </w:r>
+            <w:r>
+              <w:rPr>
+                <w:rFonts w:ascii="Latha" w:hAnsi="Latha" w:cs="Latha"/>
+                <w:szCs w:val="24"/>
+                <w:lang w:bidi="ta-IN"/>
+              </w:rPr>
+              <w:tab/>
+            </w:r>
+            <w:r>
+              <w:rPr>
+                <w:rFonts w:cs="Latha"/>
+                <w:b/>
+                <w:bCs/>
+                <w:szCs w:val="24"/>
+                <w:cs/>
+                <w:lang w:bidi="ta-IN"/>
+              </w:rPr>
+              <w:t>2.2</w:t>
+            </w:r>
+            <w:r>
+              <w:rPr>
+                <w:rFonts w:cs="Latha"/>
+                <w:b/>
+                <w:bCs/>
+                <w:szCs w:val="24"/>
+                <w:lang w:bidi="ta-IN"/>
+              </w:rPr>
+              <w:t>.12.</w:t>
+            </w:r>
+            <w:r>
+              <w:rPr>
+                <w:rFonts w:cs="Latha"/>
+                <w:b/>
+                <w:bCs/>
+                <w:szCs w:val="24"/>
+                <w:cs/>
+                <w:lang w:bidi="ta-IN"/>
+              </w:rPr>
+              <w:t>1</w:t>
+            </w:r>
+            <w:r>
+              <w:rPr>
+                <w:rFonts w:ascii="Latha" w:hAnsi="Latha" w:cs="Latha"/>
+                <w:b/>
+                <w:bCs/>
+                <w:szCs w:val="24"/>
+                <w:lang w:bidi="ta-IN"/>
+              </w:rPr>
+              <w:t>(</w:t>
+            </w:r>
+            <w:r>
+              <w:rPr>
+                <w:rFonts w:cs="Latha"/>
+                <w:b/>
+                <w:bCs/>
+                <w:szCs w:val="24"/>
+                <w:cs/>
+                <w:lang w:bidi="ta-IN"/>
+              </w:rPr>
+              <w:t>47</w:t>
+            </w:r>
+            <w:r>
+              <w:rPr>
+                <w:rFonts w:ascii="Latha" w:hAnsi="Latha" w:cs="Latha"/>
+                <w:b/>
+                <w:bCs/>
+                <w:szCs w:val="24"/>
+                <w:lang w:bidi="ta-IN"/>
+              </w:rPr>
+              <w:t>)</w:t>
+            </w:r>
+            <w:r>
+              <w:rPr>
+                <w:rFonts w:ascii="Latha" w:hAnsi="Latha" w:cs="Latha"/>
+                <w:szCs w:val="24"/>
+                <w:lang w:bidi="ta-IN"/>
+              </w:rPr>
+              <w:t xml:space="preserve">-  </w:t>
+            </w:r>
+            <w:r>
+              <w:rPr>
+                <w:rFonts w:ascii="Latha" w:hAnsi="Latha" w:cs="Latha"/>
+                <w:szCs w:val="24"/>
+                <w:cs/>
+                <w:lang w:bidi="ta-IN"/>
+              </w:rPr>
+              <w:t>ஶஶ்வ</w:t>
+            </w:r>
+            <w:r>
+              <w:rPr>
+                <w:rFonts w:ascii="BRH Tamil Tab Extra" w:hAnsi="BRH Tamil Tab Extra" w:cs="Latha"/>
+                <w:b/>
+                <w:bCs/>
+                <w:szCs w:val="28"/>
+                <w:lang w:bidi="ta-IN"/>
+              </w:rPr>
+              <w:t>†</w:t>
+            </w:r>
+            <w:r>
+              <w:rPr>
+                <w:rFonts w:ascii="Latha" w:hAnsi="Latha" w:cs="Latha"/>
+                <w:szCs w:val="24"/>
+                <w:cs/>
+                <w:lang w:bidi="ta-IN"/>
+              </w:rPr>
+              <w:t>த</w:t>
+            </w:r>
+            <w:r>
+              <w:rPr>
+                <w:rFonts w:ascii="Latha" w:hAnsi="Latha" w:cs="Latha"/>
+                <w:b/>
+                <w:bCs/>
+                <w:szCs w:val="24"/>
+                <w:cs/>
+                <w:lang w:bidi="ta-IN"/>
+              </w:rPr>
+              <w:t>:</w:t>
+            </w:r>
+            <w:r>
+              <w:rPr>
+                <w:rFonts w:ascii="Latha" w:hAnsi="Latha" w:cs="Latha"/>
+                <w:szCs w:val="24"/>
+                <w:cs/>
+                <w:lang w:bidi="ta-IN"/>
+              </w:rPr>
+              <w:t xml:space="preserve"> </w:t>
+            </w:r>
+            <w:r>
+              <w:rPr>
+                <w:rFonts w:ascii="Latha" w:hAnsi="Latha" w:cs="Latha"/>
+                <w:szCs w:val="24"/>
+                <w:lang w:bidi="ta-IN"/>
+              </w:rPr>
+              <w:t xml:space="preserve">| </w:t>
+            </w:r>
+            <w:r>
+              <w:rPr>
+                <w:rFonts w:ascii="Latha" w:hAnsi="Latha" w:cs="Latha"/>
+                <w:szCs w:val="24"/>
+                <w:cs/>
+                <w:lang w:bidi="ta-IN"/>
+              </w:rPr>
+              <w:t>க</w:t>
+            </w:r>
+            <w:r>
+              <w:rPr>
+                <w:rFonts w:ascii="BRH Tamil Tab Extra" w:hAnsi="BRH Tamil Tab Extra" w:cs="Latha"/>
+                <w:b/>
+                <w:bCs/>
+                <w:szCs w:val="28"/>
+                <w:lang w:bidi="ta-IN"/>
+              </w:rPr>
+              <w:t>…</w:t>
+            </w:r>
+            <w:r>
+              <w:rPr>
+                <w:rFonts w:ascii="Latha" w:hAnsi="Latha" w:cs="Latha"/>
+                <w:b/>
+                <w:bCs/>
+                <w:szCs w:val="24"/>
+                <w:cs/>
+                <w:lang w:bidi="ta-IN"/>
+              </w:rPr>
+              <w:t>:</w:t>
+            </w:r>
+            <w:r>
+              <w:rPr>
+                <w:rFonts w:ascii="Latha" w:hAnsi="Latha" w:cs="Latha"/>
+                <w:szCs w:val="24"/>
+                <w:cs/>
+                <w:lang w:bidi="ta-IN"/>
+              </w:rPr>
+              <w:t xml:space="preserve"> </w:t>
+            </w:r>
+            <w:r>
+              <w:rPr>
+                <w:rFonts w:ascii="Latha" w:hAnsi="Latha" w:cs="Latha"/>
+                <w:szCs w:val="24"/>
+                <w:lang w:bidi="ta-IN"/>
+              </w:rPr>
+              <w:t xml:space="preserve">| </w:t>
+            </w:r>
+          </w:p>
+          <w:p>
+            <w:pPr>
               <w:widowControl w:val="0"/>
               <w:autoSpaceDE w:val="0"/>
               <w:autoSpaceDN w:val="0"/>
@@ -249,13 +909,228 @@
             </w:pPr>
             <w:r>
               <w:rPr>
-                <w:rFonts w:cs="BRH Malayalam Extra"/>
-                <w:b/>
-                <w:bCs/>
-                <w:color w:val="000000"/>
-                <w:szCs w:val="40"/>
-              </w:rPr>
-              <w:t>None           None        None                    None</w:t>
+                <w:rFonts w:ascii="Latha" w:hAnsi="Latha" w:cs="Latha"/>
+                <w:szCs w:val="24"/>
+                <w:cs/>
+                <w:lang w:bidi="ta-IN"/>
+              </w:rPr>
+              <w:t>ஶஶ்வ</w:t>
+            </w:r>
+            <w:r>
+              <w:rPr>
+                <w:rFonts w:ascii="BRH Tamil Tab Extra" w:hAnsi="BRH Tamil Tab Extra" w:cs="Latha"/>
+                <w:b/>
+                <w:bCs/>
+                <w:szCs w:val="28"/>
+                <w:lang w:bidi="ta-IN"/>
+              </w:rPr>
+              <w:t>†</w:t>
+            </w:r>
+            <w:r>
+              <w:rPr>
+                <w:rFonts w:ascii="Latha" w:hAnsi="Latha" w:cs="Latha"/>
+                <w:szCs w:val="24"/>
+                <w:highlight w:val="green"/>
+                <w:cs/>
+                <w:lang w:bidi="ta-IN"/>
+              </w:rPr>
+              <w:t>த</w:t>
+            </w:r>
+            <w:r>
+              <w:rPr>
+                <w:rFonts w:ascii="Latha" w:hAnsi="Latha" w:cs="Latha"/>
+                <w:szCs w:val="24"/>
+                <w:highlight w:val="green"/>
+                <w:lang w:bidi="ta-IN"/>
+              </w:rPr>
+              <w:t xml:space="preserve"> </w:t>
+            </w:r>
+            <w:r>
+              <w:rPr>
+                <w:rFonts w:ascii="Latha" w:hAnsi="Latha" w:cs="Latha"/>
+                <w:szCs w:val="24"/>
+                <w:highlight w:val="green"/>
+                <w:cs/>
+                <w:lang w:bidi="ta-IN"/>
+              </w:rPr>
+              <w:t>ஸ்க</w:t>
+            </w:r>
+            <w:r>
+              <w:rPr>
+                <w:rFonts w:ascii="Latha" w:hAnsi="Latha" w:cs="Latha"/>
+                <w:b/>
+                <w:bCs/>
+                <w:szCs w:val="24"/>
+                <w:highlight w:val="green"/>
+                <w:cs/>
+                <w:lang w:bidi="ta-IN"/>
+              </w:rPr>
+              <w:t>:</w:t>
+            </w:r>
+            <w:r>
+              <w:rPr>
+                <w:rFonts w:ascii="Latha" w:hAnsi="Latha" w:cs="Latha"/>
+                <w:szCs w:val="24"/>
+                <w:cs/>
+                <w:lang w:bidi="ta-IN"/>
+              </w:rPr>
+              <w:t xml:space="preserve"> </w:t>
+            </w:r>
+            <w:r>
+              <w:rPr>
+                <w:rFonts w:ascii="Latha" w:hAnsi="Latha" w:cs="Latha"/>
+                <w:szCs w:val="24"/>
+                <w:cs/>
+                <w:lang w:bidi="ta-IN"/>
+              </w:rPr>
+              <w:t>க</w:t>
+            </w:r>
+            <w:r>
+              <w:rPr>
+                <w:rFonts w:ascii="BRH Tamil Tab Extra" w:hAnsi="BRH Tamil Tab Extra" w:cs="Latha"/>
+                <w:b/>
+                <w:bCs/>
+                <w:szCs w:val="28"/>
+                <w:lang w:bidi="ta-IN"/>
+              </w:rPr>
+              <w:t>…</w:t>
+            </w:r>
+            <w:r>
+              <w:rPr>
+                <w:rFonts w:ascii="Latha" w:hAnsi="Latha" w:cs="Latha"/>
+                <w:b/>
+                <w:bCs/>
+                <w:szCs w:val="24"/>
+                <w:cs/>
+                <w:lang w:bidi="ta-IN"/>
+              </w:rPr>
+              <w:t>:</w:t>
+            </w:r>
+            <w:r>
+              <w:rPr>
+                <w:rFonts w:ascii="Latha" w:hAnsi="Latha" w:cs="Latha"/>
+                <w:szCs w:val="24"/>
+                <w:cs/>
+                <w:lang w:bidi="ta-IN"/>
+              </w:rPr>
+              <w:t xml:space="preserve"> ஶஶ்வ</w:t>
+            </w:r>
+            <w:r>
+              <w:rPr>
+                <w:rFonts w:ascii="BRH Tamil Tab Extra" w:hAnsi="BRH Tamil Tab Extra" w:cs="Latha"/>
+                <w:b/>
+                <w:bCs/>
+                <w:szCs w:val="28"/>
+                <w:lang w:bidi="ta-IN"/>
+              </w:rPr>
+              <w:t>†</w:t>
+            </w:r>
+            <w:r>
+              <w:rPr>
+                <w:rFonts w:ascii="Latha" w:hAnsi="Latha" w:cs="Latha"/>
+                <w:szCs w:val="24"/>
+                <w:cs/>
+                <w:lang w:bidi="ta-IN"/>
+              </w:rPr>
+              <w:t>த</w:t>
+            </w:r>
+            <w:r>
+              <w:rPr>
+                <w:rFonts w:ascii="BRH Tamil Tab Extra" w:hAnsi="BRH Tamil Tab Extra" w:cs="Latha"/>
+                <w:b/>
+                <w:bCs/>
+                <w:szCs w:val="28"/>
+                <w:lang w:bidi="ta-IN"/>
+              </w:rPr>
+              <w:t>…</w:t>
+            </w:r>
+            <w:r>
+              <w:rPr>
+                <w:rFonts w:ascii="Latha" w:hAnsi="Latha" w:cs="Latha"/>
+                <w:b/>
+                <w:bCs/>
+                <w:szCs w:val="24"/>
+                <w:cs/>
+                <w:lang w:bidi="ta-IN"/>
+              </w:rPr>
+              <w:t>:</w:t>
+            </w:r>
+            <w:r>
+              <w:rPr>
+                <w:rFonts w:ascii="Latha" w:hAnsi="Latha" w:cs="Latha"/>
+                <w:szCs w:val="24"/>
+                <w:cs/>
+                <w:lang w:bidi="ta-IN"/>
+              </w:rPr>
+              <w:t xml:space="preserve"> ஶஶ்வ</w:t>
+            </w:r>
+            <w:r>
+              <w:rPr>
+                <w:rFonts w:ascii="BRH Tamil Tab Extra" w:hAnsi="BRH Tamil Tab Extra" w:cs="Latha"/>
+                <w:b/>
+                <w:bCs/>
+                <w:szCs w:val="28"/>
+                <w:lang w:bidi="ta-IN"/>
+              </w:rPr>
+              <w:t>†</w:t>
+            </w:r>
+            <w:r>
+              <w:rPr>
+                <w:rFonts w:ascii="Latha" w:hAnsi="Latha" w:cs="Latha"/>
+                <w:szCs w:val="24"/>
+                <w:highlight w:val="green"/>
+                <w:cs/>
+                <w:lang w:bidi="ta-IN"/>
+              </w:rPr>
+              <w:t>த</w:t>
+            </w:r>
+            <w:r>
+              <w:rPr>
+                <w:rFonts w:ascii="Latha" w:hAnsi="Latha" w:cs="Latha"/>
+                <w:szCs w:val="24"/>
+                <w:highlight w:val="green"/>
+                <w:lang w:bidi="ta-IN"/>
+              </w:rPr>
+              <w:t xml:space="preserve"> </w:t>
+            </w:r>
+            <w:r>
+              <w:rPr>
+                <w:rFonts w:ascii="Latha" w:hAnsi="Latha" w:cs="Latha"/>
+                <w:szCs w:val="24"/>
+                <w:highlight w:val="green"/>
+                <w:cs/>
+                <w:lang w:bidi="ta-IN"/>
+              </w:rPr>
+              <w:t>ஸ்க</w:t>
+            </w:r>
+            <w:r>
+              <w:rPr>
+                <w:rFonts w:ascii="Latha" w:hAnsi="Latha" w:cs="Latha"/>
+                <w:b/>
+                <w:bCs/>
+                <w:szCs w:val="24"/>
+                <w:highlight w:val="green"/>
+                <w:cs/>
+                <w:lang w:bidi="ta-IN"/>
+              </w:rPr>
+              <w:t>:</w:t>
+            </w:r>
+            <w:r>
+              <w:rPr>
+                <w:rFonts w:ascii="Latha" w:hAnsi="Latha" w:cs="Latha"/>
+                <w:szCs w:val="24"/>
+                <w:cs/>
+                <w:lang w:bidi="ta-IN"/>
+              </w:rPr>
+              <w:t xml:space="preserve"> </w:t>
+            </w:r>
+            <w:r>
+              <w:rPr>
+                <w:rFonts w:ascii="Latha" w:hAnsi="Latha" w:cs="Latha"/>
+                <w:szCs w:val="24"/>
+                <w:lang w:bidi="ta-IN"/>
+              </w:rPr>
+              <w:t>|</w:t>
             </w:r>
           </w:p>
         </w:tc>
@@ -3264,193 +4139,184 @@
                 <w:cs/>
                 <w:lang w:bidi="ta-IN"/>
               </w:rPr>
-              <w:t>அன</w:t>
-            </w:r>
-            <w:r>
-              <w:rPr>
-                <w:rFonts w:ascii="BRH Tamil Tab Extra" w:hAnsi="BRH Tamil Tab Extra" w:cs="Latha"/>
-                <w:b/>
-                <w:bCs/>
-                <w:szCs w:val="28"/>
-                <w:lang w:bidi="ta-IN"/>
-              </w:rPr>
-              <w:t>†</w:t>
-            </w:r>
-            <w:r>
-              <w:rPr>
-                <w:rFonts w:ascii="Latha" w:hAnsi="Latha" w:cs="Latha"/>
-                <w:szCs w:val="24"/>
-                <w:cs/>
-                <w:lang w:bidi="ta-IN"/>
-              </w:rPr>
-              <w:t>ன்வவசா</w:t>
-            </w:r>
-            <w:r>
-              <w:rPr>
-                <w:rFonts w:ascii="Latha" w:hAnsi="Latha" w:cs="Latha"/>
-                <w:szCs w:val="24"/>
-                <w:highlight w:val="yellow"/>
-                <w:cs/>
-                <w:lang w:bidi="ta-IN"/>
-              </w:rPr>
-              <w:t>ரா</w:t>
-            </w:r>
-            <w:r>
-              <w:rPr>
-                <w:rFonts w:ascii="BRH Tamil Tab Extra" w:hAnsi="BRH Tamil Tab Extra" w:cs="Latha"/>
-                <w:b/>
-                <w:bCs/>
-                <w:szCs w:val="28"/>
-                <w:lang w:bidi="ta-IN"/>
-              </w:rPr>
-              <w:t>…</w:t>
-            </w:r>
-            <w:r>
-              <w:rPr>
-                <w:rFonts w:ascii="Latha" w:hAnsi="Latha" w:cs="Latha"/>
-                <w:szCs w:val="24"/>
-                <w:cs/>
-                <w:lang w:bidi="ta-IN"/>
-              </w:rPr>
-              <w:t xml:space="preserve">ய </w:t>
-            </w:r>
-            <w:r>
-              <w:rPr>
-                <w:rFonts w:ascii="Latha" w:hAnsi="Latha" w:cs="Latha"/>
-                <w:szCs w:val="24"/>
-                <w:highlight w:val="yellow"/>
-                <w:cs/>
-                <w:lang w:bidi="ta-IN"/>
-              </w:rPr>
-              <w:t>ர</w:t>
-            </w:r>
-            <w:r>
-              <w:rPr>
-                <w:rFonts w:ascii="BRH Tamil Tab Extra" w:hAnsi="BRH Tamil Tab Extra" w:cs="Latha"/>
-                <w:b/>
-                <w:bCs/>
-                <w:szCs w:val="28"/>
-                <w:lang w:bidi="ta-IN"/>
-              </w:rPr>
-              <w:t>†</w:t>
-            </w:r>
-            <w:r>
-              <w:rPr>
-                <w:rFonts w:ascii="Latha" w:hAnsi="Latha" w:cs="Latha"/>
-                <w:szCs w:val="24"/>
-                <w:cs/>
-                <w:lang w:bidi="ta-IN"/>
-              </w:rPr>
-              <w:t>க்ஷோ</w:t>
-            </w:r>
-            <w:r>
-              <w:rPr>
-                <w:rFonts w:ascii="BRH Tamil Tab Extra" w:hAnsi="BRH Tamil Tab Extra" w:cs="Latha"/>
-                <w:b/>
-                <w:bCs/>
-                <w:szCs w:val="28"/>
-                <w:lang w:bidi="ta-IN"/>
-              </w:rPr>
-              <w:t>…</w:t>
-            </w:r>
-            <w:r>
-              <w:rPr>
-                <w:rFonts w:ascii="Latha" w:hAnsi="Latha" w:cs="Latha"/>
-                <w:szCs w:val="24"/>
-                <w:cs/>
-                <w:lang w:bidi="ta-IN"/>
-              </w:rPr>
-              <w:t>க்</w:t>
-            </w:r>
-            <w:r>
-              <w:rPr>
-                <w:rFonts w:ascii="Latha" w:hAnsi="Latha" w:cs="Latha"/>
-                <w:b/>
-                <w:bCs/>
-                <w:position w:val="-12"/>
-                <w:szCs w:val="24"/>
-                <w:cs/>
-                <w:lang w:bidi="ta-IN"/>
-              </w:rPr>
-              <w:t>4</w:t>
-            </w:r>
-            <w:r>
-              <w:rPr>
-                <w:rFonts w:ascii="Latha" w:hAnsi="Latha" w:cs="Latha"/>
-                <w:szCs w:val="24"/>
-                <w:cs/>
-                <w:lang w:bidi="ta-IN"/>
-              </w:rPr>
-              <w:t>னீ ர</w:t>
-            </w:r>
-            <w:r>
-              <w:rPr>
-                <w:rFonts w:ascii="BRH Tamil Tab Extra" w:hAnsi="BRH Tamil Tab Extra" w:cs="Latha"/>
-                <w:b/>
-                <w:bCs/>
-                <w:szCs w:val="28"/>
-                <w:lang w:bidi="ta-IN"/>
-              </w:rPr>
-              <w:t>†</w:t>
-            </w:r>
-            <w:r>
-              <w:rPr>
-                <w:rFonts w:ascii="Latha" w:hAnsi="Latha" w:cs="Latha"/>
-                <w:szCs w:val="24"/>
-                <w:cs/>
-                <w:lang w:bidi="ta-IN"/>
-              </w:rPr>
-              <w:t>க்ஷோ</w:t>
-            </w:r>
-            <w:r>
-              <w:rPr>
-                <w:rFonts w:ascii="BRH Tamil Tab Extra" w:hAnsi="BRH Tamil Tab Extra" w:cs="Latha"/>
-                <w:b/>
-                <w:bCs/>
-                <w:szCs w:val="28"/>
-                <w:lang w:bidi="ta-IN"/>
-              </w:rPr>
-              <w:t>…</w:t>
-            </w:r>
-            <w:r>
-              <w:rPr>
-                <w:rFonts w:ascii="Latha" w:hAnsi="Latha" w:cs="Latha"/>
-                <w:szCs w:val="24"/>
-                <w:cs/>
-                <w:lang w:bidi="ta-IN"/>
-              </w:rPr>
-              <w:t>க்</w:t>
-            </w:r>
-            <w:r>
-              <w:rPr>
-                <w:rFonts w:ascii="Latha" w:hAnsi="Latha" w:cs="Latha"/>
-                <w:b/>
-                <w:bCs/>
-                <w:position w:val="-12"/>
-                <w:szCs w:val="24"/>
-                <w:cs/>
-                <w:lang w:bidi="ta-IN"/>
-              </w:rPr>
-              <w:t>4</w:t>
-            </w:r>
-            <w:r>
-              <w:rPr>
-                <w:rFonts w:ascii="Latha" w:hAnsi="Latha" w:cs="Latha"/>
-                <w:szCs w:val="24"/>
-                <w:cs/>
-                <w:lang w:bidi="ta-IN"/>
-              </w:rPr>
-              <w:t xml:space="preserve">னீ </w:t>
-            </w:r>
-            <w:r>
-              <w:rPr>
-                <w:rFonts w:ascii="Latha" w:hAnsi="Latha" w:cs="Latha"/>
-                <w:szCs w:val="24"/>
-                <w:cs/>
-                <w:lang w:bidi="ta-IN"/>
-              </w:rPr>
               <w:lastRenderedPageBreak/>
               <w:t>அன</w:t>
+            </w:r>
+            <w:r>
+              <w:rPr>
+                <w:rFonts w:ascii="BRH Tamil Tab Extra" w:hAnsi="BRH Tamil Tab Extra" w:cs="Latha"/>
+                <w:b/>
+                <w:bCs/>
+                <w:szCs w:val="28"/>
+                <w:lang w:bidi="ta-IN"/>
+              </w:rPr>
+              <w:t>†</w:t>
+            </w:r>
+            <w:r>
+              <w:rPr>
+                <w:rFonts w:ascii="Latha" w:hAnsi="Latha" w:cs="Latha"/>
+                <w:szCs w:val="24"/>
+                <w:cs/>
+                <w:lang w:bidi="ta-IN"/>
+              </w:rPr>
+              <w:t>ன்வவசா</w:t>
+            </w:r>
+            <w:r>
+              <w:rPr>
+                <w:rFonts w:ascii="Latha" w:hAnsi="Latha" w:cs="Latha"/>
+                <w:szCs w:val="24"/>
+                <w:highlight w:val="yellow"/>
+                <w:cs/>
+                <w:lang w:bidi="ta-IN"/>
+              </w:rPr>
+              <w:t>ரா</w:t>
+            </w:r>
+            <w:r>
+              <w:rPr>
+                <w:rFonts w:ascii="BRH Tamil Tab Extra" w:hAnsi="BRH Tamil Tab Extra" w:cs="Latha"/>
+                <w:b/>
+                <w:bCs/>
+                <w:szCs w:val="28"/>
+                <w:lang w:bidi="ta-IN"/>
+              </w:rPr>
+              <w:t>…</w:t>
+            </w:r>
+            <w:r>
+              <w:rPr>
+                <w:rFonts w:ascii="Latha" w:hAnsi="Latha" w:cs="Latha"/>
+                <w:szCs w:val="24"/>
+                <w:cs/>
+                <w:lang w:bidi="ta-IN"/>
+              </w:rPr>
+              <w:t xml:space="preserve">ய </w:t>
+            </w:r>
+            <w:r>
+              <w:rPr>
+                <w:rFonts w:ascii="Latha" w:hAnsi="Latha" w:cs="Latha"/>
+                <w:szCs w:val="24"/>
+                <w:highlight w:val="yellow"/>
+                <w:cs/>
+                <w:lang w:bidi="ta-IN"/>
+              </w:rPr>
+              <w:t>ர</w:t>
+            </w:r>
+            <w:r>
+              <w:rPr>
+                <w:rFonts w:ascii="BRH Tamil Tab Extra" w:hAnsi="BRH Tamil Tab Extra" w:cs="Latha"/>
+                <w:b/>
+                <w:bCs/>
+                <w:szCs w:val="28"/>
+                <w:lang w:bidi="ta-IN"/>
+              </w:rPr>
+              <w:t>†</w:t>
+            </w:r>
+            <w:r>
+              <w:rPr>
+                <w:rFonts w:ascii="Latha" w:hAnsi="Latha" w:cs="Latha"/>
+                <w:szCs w:val="24"/>
+                <w:cs/>
+                <w:lang w:bidi="ta-IN"/>
+              </w:rPr>
+              <w:t>க்ஷோ</w:t>
+            </w:r>
+            <w:r>
+              <w:rPr>
+                <w:rFonts w:ascii="BRH Tamil Tab Extra" w:hAnsi="BRH Tamil Tab Extra" w:cs="Latha"/>
+                <w:b/>
+                <w:bCs/>
+                <w:szCs w:val="28"/>
+                <w:lang w:bidi="ta-IN"/>
+              </w:rPr>
+              <w:t>…</w:t>
+            </w:r>
+            <w:r>
+              <w:rPr>
+                <w:rFonts w:ascii="Latha" w:hAnsi="Latha" w:cs="Latha"/>
+                <w:szCs w:val="24"/>
+                <w:cs/>
+                <w:lang w:bidi="ta-IN"/>
+              </w:rPr>
+              <w:t>க்</w:t>
+            </w:r>
+            <w:r>
+              <w:rPr>
+                <w:rFonts w:ascii="Latha" w:hAnsi="Latha" w:cs="Latha"/>
+                <w:b/>
+                <w:bCs/>
+                <w:position w:val="-12"/>
+                <w:szCs w:val="24"/>
+                <w:cs/>
+                <w:lang w:bidi="ta-IN"/>
+              </w:rPr>
+              <w:t>4</w:t>
+            </w:r>
+            <w:r>
+              <w:rPr>
+                <w:rFonts w:ascii="Latha" w:hAnsi="Latha" w:cs="Latha"/>
+                <w:szCs w:val="24"/>
+                <w:cs/>
+                <w:lang w:bidi="ta-IN"/>
+              </w:rPr>
+              <w:t>னீ ர</w:t>
+            </w:r>
+            <w:r>
+              <w:rPr>
+                <w:rFonts w:ascii="BRH Tamil Tab Extra" w:hAnsi="BRH Tamil Tab Extra" w:cs="Latha"/>
+                <w:b/>
+                <w:bCs/>
+                <w:szCs w:val="28"/>
+                <w:lang w:bidi="ta-IN"/>
+              </w:rPr>
+              <w:t>†</w:t>
+            </w:r>
+            <w:r>
+              <w:rPr>
+                <w:rFonts w:ascii="Latha" w:hAnsi="Latha" w:cs="Latha"/>
+                <w:szCs w:val="24"/>
+                <w:cs/>
+                <w:lang w:bidi="ta-IN"/>
+              </w:rPr>
+              <w:t>க்ஷோ</w:t>
+            </w:r>
+            <w:r>
+              <w:rPr>
+                <w:rFonts w:ascii="BRH Tamil Tab Extra" w:hAnsi="BRH Tamil Tab Extra" w:cs="Latha"/>
+                <w:b/>
+                <w:bCs/>
+                <w:szCs w:val="28"/>
+                <w:lang w:bidi="ta-IN"/>
+              </w:rPr>
+              <w:t>…</w:t>
+            </w:r>
+            <w:r>
+              <w:rPr>
+                <w:rFonts w:ascii="Latha" w:hAnsi="Latha" w:cs="Latha"/>
+                <w:szCs w:val="24"/>
+                <w:cs/>
+                <w:lang w:bidi="ta-IN"/>
+              </w:rPr>
+              <w:t>க்</w:t>
+            </w:r>
+            <w:r>
+              <w:rPr>
+                <w:rFonts w:ascii="Latha" w:hAnsi="Latha" w:cs="Latha"/>
+                <w:b/>
+                <w:bCs/>
+                <w:position w:val="-12"/>
+                <w:szCs w:val="24"/>
+                <w:cs/>
+                <w:lang w:bidi="ta-IN"/>
+              </w:rPr>
+              <w:t>4</w:t>
+            </w:r>
+            <w:r>
+              <w:rPr>
+                <w:rFonts w:ascii="Latha" w:hAnsi="Latha" w:cs="Latha"/>
+                <w:szCs w:val="24"/>
+                <w:cs/>
+                <w:lang w:bidi="ta-IN"/>
+              </w:rPr>
+              <w:t>னீ அன</w:t>
             </w:r>
             <w:r>
               <w:rPr>
@@ -4735,173 +5601,164 @@
                 <w:cs/>
                 <w:lang w:bidi="ta-IN"/>
               </w:rPr>
-              <w:t>அன</w:t>
-            </w:r>
-            <w:r>
-              <w:rPr>
-                <w:rFonts w:ascii="BRH Tamil Tab Extra" w:hAnsi="BRH Tamil Tab Extra" w:cs="Latha"/>
-                <w:b/>
-                <w:bCs/>
-                <w:szCs w:val="28"/>
-                <w:lang w:bidi="ta-IN"/>
-              </w:rPr>
-              <w:t>†</w:t>
-            </w:r>
-            <w:r>
-              <w:rPr>
-                <w:rFonts w:ascii="Latha" w:hAnsi="Latha" w:cs="Latha"/>
-                <w:szCs w:val="24"/>
-                <w:cs/>
-                <w:lang w:bidi="ta-IN"/>
-              </w:rPr>
-              <w:t>ன்வவசா</w:t>
-            </w:r>
-            <w:r>
-              <w:rPr>
-                <w:rFonts w:ascii="Latha" w:hAnsi="Latha" w:cs="Latha"/>
-                <w:szCs w:val="24"/>
-                <w:highlight w:val="green"/>
-                <w:cs/>
-                <w:lang w:bidi="ta-IN"/>
-              </w:rPr>
-              <w:t>ரா</w:t>
-            </w:r>
-            <w:r>
-              <w:rPr>
-                <w:rFonts w:ascii="Latha" w:hAnsi="Latha" w:cs="Latha"/>
-                <w:szCs w:val="24"/>
-                <w:cs/>
-                <w:lang w:bidi="ta-IN"/>
-              </w:rPr>
-              <w:t xml:space="preserve">ய </w:t>
-            </w:r>
-            <w:r>
-              <w:rPr>
-                <w:rFonts w:ascii="Latha" w:hAnsi="Latha" w:cs="Latha"/>
-                <w:szCs w:val="24"/>
-                <w:highlight w:val="green"/>
-                <w:cs/>
-                <w:lang w:bidi="ta-IN"/>
-              </w:rPr>
-              <w:t>ர</w:t>
-            </w:r>
-            <w:r>
-              <w:rPr>
-                <w:rFonts w:ascii="Latha" w:hAnsi="Latha" w:cs="Latha"/>
-                <w:szCs w:val="24"/>
-                <w:cs/>
-                <w:lang w:bidi="ta-IN"/>
-              </w:rPr>
-              <w:t>க்ஷோ</w:t>
-            </w:r>
-            <w:r>
-              <w:rPr>
-                <w:rFonts w:ascii="BRH Tamil Tab Extra" w:hAnsi="BRH Tamil Tab Extra" w:cs="Latha"/>
-                <w:b/>
-                <w:bCs/>
-                <w:szCs w:val="28"/>
-                <w:lang w:bidi="ta-IN"/>
-              </w:rPr>
-              <w:t>…</w:t>
-            </w:r>
-            <w:r>
-              <w:rPr>
-                <w:rFonts w:ascii="Latha" w:hAnsi="Latha" w:cs="Latha"/>
-                <w:szCs w:val="24"/>
-                <w:cs/>
-                <w:lang w:bidi="ta-IN"/>
-              </w:rPr>
-              <w:t>க்</w:t>
-            </w:r>
-            <w:r>
-              <w:rPr>
-                <w:rFonts w:ascii="Latha" w:hAnsi="Latha" w:cs="Latha"/>
-                <w:b/>
-                <w:bCs/>
-                <w:position w:val="-12"/>
-                <w:szCs w:val="24"/>
-                <w:cs/>
-                <w:lang w:bidi="ta-IN"/>
-              </w:rPr>
-              <w:t>4</w:t>
-            </w:r>
-            <w:r>
-              <w:rPr>
-                <w:rFonts w:ascii="Latha" w:hAnsi="Latha" w:cs="Latha"/>
-                <w:szCs w:val="24"/>
-                <w:cs/>
-                <w:lang w:bidi="ta-IN"/>
-              </w:rPr>
-              <w:t>னீ ர</w:t>
-            </w:r>
-            <w:r>
-              <w:rPr>
-                <w:rFonts w:ascii="BRH Tamil Tab Extra" w:hAnsi="BRH Tamil Tab Extra" w:cs="Latha"/>
-                <w:b/>
-                <w:bCs/>
-                <w:szCs w:val="28"/>
-                <w:lang w:bidi="ta-IN"/>
-              </w:rPr>
-              <w:t>†</w:t>
-            </w:r>
-            <w:r>
-              <w:rPr>
-                <w:rFonts w:ascii="Latha" w:hAnsi="Latha" w:cs="Latha"/>
-                <w:szCs w:val="24"/>
-                <w:cs/>
-                <w:lang w:bidi="ta-IN"/>
-              </w:rPr>
-              <w:t>க்ஷோ</w:t>
-            </w:r>
-            <w:r>
-              <w:rPr>
-                <w:rFonts w:ascii="BRH Tamil Tab Extra" w:hAnsi="BRH Tamil Tab Extra" w:cs="Latha"/>
-                <w:b/>
-                <w:bCs/>
-                <w:szCs w:val="28"/>
-                <w:lang w:bidi="ta-IN"/>
-              </w:rPr>
-              <w:t>…</w:t>
-            </w:r>
-            <w:r>
-              <w:rPr>
-                <w:rFonts w:ascii="Latha" w:hAnsi="Latha" w:cs="Latha"/>
-                <w:szCs w:val="24"/>
-                <w:cs/>
-                <w:lang w:bidi="ta-IN"/>
-              </w:rPr>
-              <w:t>க்</w:t>
-            </w:r>
-            <w:r>
-              <w:rPr>
-                <w:rFonts w:ascii="Latha" w:hAnsi="Latha" w:cs="Latha"/>
-                <w:b/>
-                <w:bCs/>
-                <w:position w:val="-12"/>
-                <w:szCs w:val="24"/>
-                <w:cs/>
-                <w:lang w:bidi="ta-IN"/>
-              </w:rPr>
-              <w:t>4</w:t>
-            </w:r>
-            <w:r>
-              <w:rPr>
-                <w:rFonts w:ascii="Latha" w:hAnsi="Latha" w:cs="Latha"/>
-                <w:szCs w:val="24"/>
-                <w:cs/>
-                <w:lang w:bidi="ta-IN"/>
-              </w:rPr>
-              <w:t xml:space="preserve">னீ </w:t>
-            </w:r>
-            <w:r>
-              <w:rPr>
-                <w:rFonts w:ascii="Latha" w:hAnsi="Latha" w:cs="Latha"/>
-                <w:szCs w:val="24"/>
-                <w:cs/>
-                <w:lang w:bidi="ta-IN"/>
-              </w:rPr>
               <w:lastRenderedPageBreak/>
               <w:t>அன</w:t>
+            </w:r>
+            <w:r>
+              <w:rPr>
+                <w:rFonts w:ascii="BRH Tamil Tab Extra" w:hAnsi="BRH Tamil Tab Extra" w:cs="Latha"/>
+                <w:b/>
+                <w:bCs/>
+                <w:szCs w:val="28"/>
+                <w:lang w:bidi="ta-IN"/>
+              </w:rPr>
+              <w:t>†</w:t>
+            </w:r>
+            <w:r>
+              <w:rPr>
+                <w:rFonts w:ascii="Latha" w:hAnsi="Latha" w:cs="Latha"/>
+                <w:szCs w:val="24"/>
+                <w:cs/>
+                <w:lang w:bidi="ta-IN"/>
+              </w:rPr>
+              <w:t>ன்வவசா</w:t>
+            </w:r>
+            <w:r>
+              <w:rPr>
+                <w:rFonts w:ascii="Latha" w:hAnsi="Latha" w:cs="Latha"/>
+                <w:szCs w:val="24"/>
+                <w:highlight w:val="green"/>
+                <w:cs/>
+                <w:lang w:bidi="ta-IN"/>
+              </w:rPr>
+              <w:t>ரா</w:t>
+            </w:r>
+            <w:r>
+              <w:rPr>
+                <w:rFonts w:ascii="Latha" w:hAnsi="Latha" w:cs="Latha"/>
+                <w:szCs w:val="24"/>
+                <w:cs/>
+                <w:lang w:bidi="ta-IN"/>
+              </w:rPr>
+              <w:t xml:space="preserve">ய </w:t>
+            </w:r>
+            <w:r>
+              <w:rPr>
+                <w:rFonts w:ascii="Latha" w:hAnsi="Latha" w:cs="Latha"/>
+                <w:szCs w:val="24"/>
+                <w:highlight w:val="green"/>
+                <w:cs/>
+                <w:lang w:bidi="ta-IN"/>
+              </w:rPr>
+              <w:t>ர</w:t>
+            </w:r>
+            <w:r>
+              <w:rPr>
+                <w:rFonts w:ascii="Latha" w:hAnsi="Latha" w:cs="Latha"/>
+                <w:szCs w:val="24"/>
+                <w:cs/>
+                <w:lang w:bidi="ta-IN"/>
+              </w:rPr>
+              <w:t>க்ஷோ</w:t>
+            </w:r>
+            <w:r>
+              <w:rPr>
+                <w:rFonts w:ascii="BRH Tamil Tab Extra" w:hAnsi="BRH Tamil Tab Extra" w:cs="Latha"/>
+                <w:b/>
+                <w:bCs/>
+                <w:szCs w:val="28"/>
+                <w:lang w:bidi="ta-IN"/>
+              </w:rPr>
+              <w:t>…</w:t>
+            </w:r>
+            <w:r>
+              <w:rPr>
+                <w:rFonts w:ascii="Latha" w:hAnsi="Latha" w:cs="Latha"/>
+                <w:szCs w:val="24"/>
+                <w:cs/>
+                <w:lang w:bidi="ta-IN"/>
+              </w:rPr>
+              <w:t>க்</w:t>
+            </w:r>
+            <w:r>
+              <w:rPr>
+                <w:rFonts w:ascii="Latha" w:hAnsi="Latha" w:cs="Latha"/>
+                <w:b/>
+                <w:bCs/>
+                <w:position w:val="-12"/>
+                <w:szCs w:val="24"/>
+                <w:cs/>
+                <w:lang w:bidi="ta-IN"/>
+              </w:rPr>
+              <w:t>4</w:t>
+            </w:r>
+            <w:r>
+              <w:rPr>
+                <w:rFonts w:ascii="Latha" w:hAnsi="Latha" w:cs="Latha"/>
+                <w:szCs w:val="24"/>
+                <w:cs/>
+                <w:lang w:bidi="ta-IN"/>
+              </w:rPr>
+              <w:t>னீ ர</w:t>
+            </w:r>
+            <w:r>
+              <w:rPr>
+                <w:rFonts w:ascii="BRH Tamil Tab Extra" w:hAnsi="BRH Tamil Tab Extra" w:cs="Latha"/>
+                <w:b/>
+                <w:bCs/>
+                <w:szCs w:val="28"/>
+                <w:lang w:bidi="ta-IN"/>
+              </w:rPr>
+              <w:t>†</w:t>
+            </w:r>
+            <w:r>
+              <w:rPr>
+                <w:rFonts w:ascii="Latha" w:hAnsi="Latha" w:cs="Latha"/>
+                <w:szCs w:val="24"/>
+                <w:cs/>
+                <w:lang w:bidi="ta-IN"/>
+              </w:rPr>
+              <w:t>க்ஷோ</w:t>
+            </w:r>
+            <w:r>
+              <w:rPr>
+                <w:rFonts w:ascii="BRH Tamil Tab Extra" w:hAnsi="BRH Tamil Tab Extra" w:cs="Latha"/>
+                <w:b/>
+                <w:bCs/>
+                <w:szCs w:val="28"/>
+                <w:lang w:bidi="ta-IN"/>
+              </w:rPr>
+              <w:t>…</w:t>
+            </w:r>
+            <w:r>
+              <w:rPr>
+                <w:rFonts w:ascii="Latha" w:hAnsi="Latha" w:cs="Latha"/>
+                <w:szCs w:val="24"/>
+                <w:cs/>
+                <w:lang w:bidi="ta-IN"/>
+              </w:rPr>
+              <w:t>க்</w:t>
+            </w:r>
+            <w:r>
+              <w:rPr>
+                <w:rFonts w:ascii="Latha" w:hAnsi="Latha" w:cs="Latha"/>
+                <w:b/>
+                <w:bCs/>
+                <w:position w:val="-12"/>
+                <w:szCs w:val="24"/>
+                <w:cs/>
+                <w:lang w:bidi="ta-IN"/>
+              </w:rPr>
+              <w:t>4</w:t>
+            </w:r>
+            <w:r>
+              <w:rPr>
+                <w:rFonts w:ascii="Latha" w:hAnsi="Latha" w:cs="Latha"/>
+                <w:szCs w:val="24"/>
+                <w:cs/>
+                <w:lang w:bidi="ta-IN"/>
+              </w:rPr>
+              <w:t>னீ அன</w:t>
             </w:r>
             <w:r>
               <w:rPr>
@@ -9221,6 +10078,7 @@
                 <w:cs/>
                 <w:lang w:bidi="ta-IN"/>
               </w:rPr>
+              <w:lastRenderedPageBreak/>
               <w:t>ஸம்</w:t>
             </w:r>
             <w:r>
@@ -9664,6 +10522,7 @@
                 <w:cs/>
                 <w:lang w:bidi="ta-IN"/>
               </w:rPr>
+              <w:lastRenderedPageBreak/>
               <w:t>6</w:t>
             </w:r>
             <w:r>
@@ -10482,6 +11341,7 @@
                 <w:cs/>
                 <w:lang w:bidi="ta-IN"/>
               </w:rPr>
+              <w:lastRenderedPageBreak/>
               <w:t>ஸ</w:t>
             </w:r>
             <w:r>
@@ -10960,7 +11820,6 @@
                 <w:sz w:val="32"/>
                 <w:szCs w:val="40"/>
               </w:rPr>
-              <w:lastRenderedPageBreak/>
               <w:t xml:space="preserve"> </w:t>
             </w:r>
           </w:p>
@@ -29428,7 +30287,7 @@
 </file>
 
 <file path=word/endnotes.xml><?xml version="1.0" encoding="utf-8"?>
-<w:endnotes xmlns:wpc="http://schemas.microsoft.com/office/word/2010/wordprocessingCanvas" xmlns:cx="http://schemas.microsoft.com/office/drawing/2014/chartex" xmlns:cx1="http://schemas.microsoft.com/office/drawing/2015/9/8/chartex" xmlns:cx2="http://schemas.microsoft.com/office/drawing/2015/10/21/chartex" xmlns:cx3="http://schemas.microsoft.com/office/drawing/2016/5/9/chartex" xmlns:cx4="http://schemas.microsoft.com/office/drawing/2016/5/10/chartex" xmlns:cx5="http://schemas.microsoft.com/office/drawing/2016/5/11/chartex" xmlns:cx6="http://schemas.microsoft.com/office/drawing/2016/5/12/chartex" xmlns:cx7="http://schemas.microsoft.com/office/drawing/2016/5/13/chartex" xmlns:cx8="http://schemas.microsoft.com/office/drawing/2016/5/14/chartex" xmlns:mc="http://schemas.openxmlformats.org/markup-compatibility/2006" xmlns:aink="http://schemas.microsoft.com/office/drawing/2016/ink" xmlns:am3d="http://schemas.microsoft.com/office/drawing/2017/model3d" xmlns:o="urn:schemas-microsoft-com:office:office" xmlns:oel="http://schemas.microsoft.com/office/2019/extlst" xmlns:r="http://schemas.openxmlformats.org/officeDocument/2006/relationships" xmlns:m="http://schemas.openxmlformats.org/officeDocument/2006/math" xmlns:v="urn:schemas-microsoft-com:vml" xmlns:wp14="http://schemas.microsoft.com/office/word/2010/wordprocessingDrawing" xmlns:wp="http://schemas.openxmlformats.org/drawingml/2006/wordprocessingDrawing" xmlns:w10="urn:schemas-microsoft-com:office:word" xmlns:w="http://schemas.openxmlformats.org/wordprocessingml/2006/main" xmlns:w14="http://schemas.microsoft.com/office/word/2010/wordml" xmlns:w15="http://schemas.microsoft.com/office/word/2012/wordml" xmlns:w16cex="http://schemas.microsoft.com/office/word/2018/wordml/cex" xmlns:w16cid="http://schemas.microsoft.com/office/word/2016/wordml/cid" xmlns:w16="http://schemas.microsoft.com/office/word/2018/wordml" xmlns:w16du="http://schemas.microsoft.com/office/word/2023/wordml/word16du" xmlns:w16sdtdh="http://schemas.microsoft.com/office/word/2020/wordml/sdtdatahash" xmlns:w16sdtfl="http://schemas.microsoft.com/office/word/2024/wordml/sdtformatlock" xmlns:w16se="http://schemas.microsoft.com/office/word/2015/wordml/symex" xmlns:wpg="http://schemas.microsoft.com/office/word/2010/wordprocessingGroup" xmlns:wpi="http://schemas.microsoft.com/office/word/2010/wordprocessingInk" xmlns:wne="http://schemas.microsoft.com/office/word/2006/wordml" xmlns:wps="http://schemas.microsoft.com/office/word/2010/wordprocessingShape" mc:Ignorable="w14 w15 w16se w16cid w16 w16cex w16sdtdh w16sdtfl w16du wp14">
+<w:endnotes xmlns:wpc="http://schemas.microsoft.com/office/word/2010/wordprocessingCanvas" xmlns:cx="http://schemas.microsoft.com/office/drawing/2014/chartex" xmlns:cx1="http://schemas.microsoft.com/office/drawing/2015/9/8/chartex" xmlns:cx2="http://schemas.microsoft.com/office/drawing/2015/10/21/chartex" xmlns:cx3="http://schemas.microsoft.com/office/drawing/2016/5/9/chartex" xmlns:cx4="http://schemas.microsoft.com/office/drawing/2016/5/10/chartex" xmlns:cx5="http://schemas.microsoft.com/office/drawing/2016/5/11/chartex" xmlns:cx6="http://schemas.microsoft.com/office/drawing/2016/5/12/chartex" xmlns:cx7="http://schemas.microsoft.com/office/drawing/2016/5/13/chartex" xmlns:cx8="http://schemas.microsoft.com/office/drawing/2016/5/14/chartex" xmlns:mc="http://schemas.openxmlformats.org/markup-compatibility/2006" xmlns:aink="http://schemas.microsoft.com/office/drawing/2016/ink" xmlns:am3d="http://schemas.microsoft.com/office/drawing/2017/model3d" xmlns:o="urn:schemas-microsoft-com:office:office" xmlns:oel="http://schemas.microsoft.com/office/2019/extlst" xmlns:r="http://schemas.openxmlformats.org/officeDocument/2006/relationships" xmlns:m="http://schemas.openxmlformats.org/officeDocument/2006/math" xmlns:v="urn:schemas-microsoft-com:vml" xmlns:wp14="http://schemas.microsoft.com/office/word/2010/wordprocessingDrawing" xmlns:wp="http://schemas.openxmlformats.org/drawingml/2006/wordprocessingDrawing" xmlns:w10="urn:schemas-microsoft-com:office:word" xmlns:w="http://schemas.openxmlformats.org/wordprocessingml/2006/main" xmlns:w14="http://schemas.microsoft.com/office/word/2010/wordml" xmlns:w15="http://schemas.microsoft.com/office/word/2012/wordml" xmlns:w16cei="http://schemas.microsoft.com/office/word/2026/wordml/cei" xmlns:w16cex="http://schemas.microsoft.com/office/word/2018/wordml/cex" xmlns:w16cid="http://schemas.microsoft.com/office/word/2016/wordml/cid" xmlns:w16="http://schemas.microsoft.com/office/word/2018/wordml" xmlns:w16du="http://schemas.microsoft.com/office/word/2023/wordml/word16du" xmlns:w16sdtdh="http://schemas.microsoft.com/office/word/2020/wordml/sdtdatahash" xmlns:w16sdtfl="http://schemas.microsoft.com/office/word/2024/wordml/sdtformatlock" xmlns:w16se="http://schemas.microsoft.com/office/word/2015/wordml/symex" xmlns:wpg="http://schemas.microsoft.com/office/word/2010/wordprocessingGroup" xmlns:wpi="http://schemas.microsoft.com/office/word/2010/wordprocessingInk" xmlns:wne="http://schemas.microsoft.com/office/word/2006/wordml" xmlns:wps="http://schemas.microsoft.com/office/word/2010/wordprocessingShape" mc:Ignorable="w14 w15 w16se w16cid w16 w16cex w16sdtdh w16sdtfl w16du wp14">
   <w:endnote w:type="separator" w:id="-1">
     <w:p>
       <w:pPr>
@@ -29453,7 +30312,7 @@
 </file>
 
 <file path=word/footer1.xml><?xml version="1.0" encoding="utf-8"?>
-<w:ftr xmlns:wpc="http://schemas.microsoft.com/office/word/2010/wordprocessingCanvas" xmlns:cx="http://schemas.microsoft.com/office/drawing/2014/chartex" xmlns:cx1="http://schemas.microsoft.com/office/drawing/2015/9/8/chartex" xmlns:cx2="http://schemas.microsoft.com/office/drawing/2015/10/21/chartex" xmlns:cx3="http://schemas.microsoft.com/office/drawing/2016/5/9/chartex" xmlns:cx4="http://schemas.microsoft.com/office/drawing/2016/5/10/chartex" xmlns:cx5="http://schemas.microsoft.com/office/drawing/2016/5/11/chartex" xmlns:cx6="http://schemas.microsoft.com/office/drawing/2016/5/12/chartex" xmlns:cx7="http://schemas.microsoft.com/office/drawing/2016/5/13/chartex" xmlns:cx8="http://schemas.microsoft.com/office/drawing/2016/5/14/chartex" xmlns:mc="http://schemas.openxmlformats.org/markup-compatibility/2006" xmlns:aink="http://schemas.microsoft.com/office/drawing/2016/ink" xmlns:am3d="http://schemas.microsoft.com/office/drawing/2017/model3d" xmlns:o="urn:schemas-microsoft-com:office:office" xmlns:oel="http://schemas.microsoft.com/office/2019/extlst" xmlns:r="http://schemas.openxmlformats.org/officeDocument/2006/relationships" xmlns:m="http://schemas.openxmlformats.org/officeDocument/2006/math" xmlns:v="urn:schemas-microsoft-com:vml" xmlns:wp14="http://schemas.microsoft.com/office/word/2010/wordprocessingDrawing" xmlns:wp="http://schemas.openxmlformats.org/drawingml/2006/wordprocessingDrawing" xmlns:w10="urn:schemas-microsoft-com:office:word" xmlns:w="http://schemas.openxmlformats.org/wordprocessingml/2006/main" xmlns:w14="http://schemas.microsoft.com/office/word/2010/wordml" xmlns:w15="http://schemas.microsoft.com/office/word/2012/wordml" xmlns:w16cex="http://schemas.microsoft.com/office/word/2018/wordml/cex" xmlns:w16cid="http://schemas.microsoft.com/office/word/2016/wordml/cid" xmlns:w16="http://schemas.microsoft.com/office/word/2018/wordml" xmlns:w16du="http://schemas.microsoft.com/office/word/2023/wordml/word16du" xmlns:w16sdtdh="http://schemas.microsoft.com/office/word/2020/wordml/sdtdatahash" xmlns:w16sdtfl="http://schemas.microsoft.com/office/word/2024/wordml/sdtformatlock" xmlns:w16se="http://schemas.microsoft.com/office/word/2015/wordml/symex" xmlns:wpg="http://schemas.microsoft.com/office/word/2010/wordprocessingGroup" xmlns:wpi="http://schemas.microsoft.com/office/word/2010/wordprocessingInk" xmlns:wne="http://schemas.microsoft.com/office/word/2006/wordml" xmlns:wps="http://schemas.microsoft.com/office/word/2010/wordprocessingShape" mc:Ignorable="w14 w15 w16se w16cid w16 w16cex w16sdtdh w16sdtfl w16du wp14">
+<w:ftr xmlns:wpc="http://schemas.microsoft.com/office/word/2010/wordprocessingCanvas" xmlns:cx="http://schemas.microsoft.com/office/drawing/2014/chartex" xmlns:cx1="http://schemas.microsoft.com/office/drawing/2015/9/8/chartex" xmlns:cx2="http://schemas.microsoft.com/office/drawing/2015/10/21/chartex" xmlns:cx3="http://schemas.microsoft.com/office/drawing/2016/5/9/chartex" xmlns:cx4="http://schemas.microsoft.com/office/drawing/2016/5/10/chartex" xmlns:cx5="http://schemas.microsoft.com/office/drawing/2016/5/11/chartex" xmlns:cx6="http://schemas.microsoft.com/office/drawing/2016/5/12/chartex" xmlns:cx7="http://schemas.microsoft.com/office/drawing/2016/5/13/chartex" xmlns:cx8="http://schemas.microsoft.com/office/drawing/2016/5/14/chartex" xmlns:mc="http://schemas.openxmlformats.org/markup-compatibility/2006" xmlns:aink="http://schemas.microsoft.com/office/drawing/2016/ink" xmlns:am3d="http://schemas.microsoft.com/office/drawing/2017/model3d" xmlns:o="urn:schemas-microsoft-com:office:office" xmlns:oel="http://schemas.microsoft.com/office/2019/extlst" xmlns:r="http://schemas.openxmlformats.org/officeDocument/2006/relationships" xmlns:m="http://schemas.openxmlformats.org/officeDocument/2006/math" xmlns:v="urn:schemas-microsoft-com:vml" xmlns:wp14="http://schemas.microsoft.com/office/word/2010/wordprocessingDrawing" xmlns:wp="http://schemas.openxmlformats.org/drawingml/2006/wordprocessingDrawing" xmlns:w10="urn:schemas-microsoft-com:office:word" xmlns:w="http://schemas.openxmlformats.org/wordprocessingml/2006/main" xmlns:w14="http://schemas.microsoft.com/office/word/2010/wordml" xmlns:w15="http://schemas.microsoft.com/office/word/2012/wordml" xmlns:w16cei="http://schemas.microsoft.com/office/word/2026/wordml/cei" xmlns:w16cex="http://schemas.microsoft.com/office/word/2018/wordml/cex" xmlns:w16cid="http://schemas.microsoft.com/office/word/2016/wordml/cid" xmlns:w16="http://schemas.microsoft.com/office/word/2018/wordml" xmlns:w16du="http://schemas.microsoft.com/office/word/2023/wordml/word16du" xmlns:w16sdtdh="http://schemas.microsoft.com/office/word/2020/wordml/sdtdatahash" xmlns:w16sdtfl="http://schemas.microsoft.com/office/word/2024/wordml/sdtformatlock" xmlns:w16se="http://schemas.microsoft.com/office/word/2015/wordml/symex" xmlns:wpg="http://schemas.microsoft.com/office/word/2010/wordprocessingGroup" xmlns:wpi="http://schemas.microsoft.com/office/word/2010/wordprocessingInk" xmlns:wne="http://schemas.microsoft.com/office/word/2006/wordml" xmlns:wps="http://schemas.microsoft.com/office/word/2010/wordprocessingShape" mc:Ignorable="w14 w15 w16se w16cid w16 w16cex w16sdtdh w16sdtfl w16du wp14">
   <w:p>
     <w:pPr>
       <w:pBdr>
@@ -29638,7 +30497,7 @@
 </file>
 
 <file path=word/footer2.xml><?xml version="1.0" encoding="utf-8"?>
-<w:ftr xmlns:wpc="http://schemas.microsoft.com/office/word/2010/wordprocessingCanvas" xmlns:cx="http://schemas.microsoft.com/office/drawing/2014/chartex" xmlns:cx1="http://schemas.microsoft.com/office/drawing/2015/9/8/chartex" xmlns:cx2="http://schemas.microsoft.com/office/drawing/2015/10/21/chartex" xmlns:cx3="http://schemas.microsoft.com/office/drawing/2016/5/9/chartex" xmlns:cx4="http://schemas.microsoft.com/office/drawing/2016/5/10/chartex" xmlns:cx5="http://schemas.microsoft.com/office/drawing/2016/5/11/chartex" xmlns:cx6="http://schemas.microsoft.com/office/drawing/2016/5/12/chartex" xmlns:cx7="http://schemas.microsoft.com/office/drawing/2016/5/13/chartex" xmlns:cx8="http://schemas.microsoft.com/office/drawing/2016/5/14/chartex" xmlns:mc="http://schemas.openxmlformats.org/markup-compatibility/2006" xmlns:aink="http://schemas.microsoft.com/office/drawing/2016/ink" xmlns:am3d="http://schemas.microsoft.com/office/drawing/2017/model3d" xmlns:o="urn:schemas-microsoft-com:office:office" xmlns:oel="http://schemas.microsoft.com/office/2019/extlst" xmlns:r="http://schemas.openxmlformats.org/officeDocument/2006/relationships" xmlns:m="http://schemas.openxmlformats.org/officeDocument/2006/math" xmlns:v="urn:schemas-microsoft-com:vml" xmlns:wp14="http://schemas.microsoft.com/office/word/2010/wordprocessingDrawing" xmlns:wp="http://schemas.openxmlformats.org/drawingml/2006/wordprocessingDrawing" xmlns:w10="urn:schemas-microsoft-com:office:word" xmlns:w="http://schemas.openxmlformats.org/wordprocessingml/2006/main" xmlns:w14="http://schemas.microsoft.com/office/word/2010/wordml" xmlns:w15="http://schemas.microsoft.com/office/word/2012/wordml" xmlns:w16cex="http://schemas.microsoft.com/office/word/2018/wordml/cex" xmlns:w16cid="http://schemas.microsoft.com/office/word/2016/wordml/cid" xmlns:w16="http://schemas.microsoft.com/office/word/2018/wordml" xmlns:w16du="http://schemas.microsoft.com/office/word/2023/wordml/word16du" xmlns:w16sdtdh="http://schemas.microsoft.com/office/word/2020/wordml/sdtdatahash" xmlns:w16sdtfl="http://schemas.microsoft.com/office/word/2024/wordml/sdtformatlock" xmlns:w16se="http://schemas.microsoft.com/office/word/2015/wordml/symex" xmlns:wpg="http://schemas.microsoft.com/office/word/2010/wordprocessingGroup" xmlns:wpi="http://schemas.microsoft.com/office/word/2010/wordprocessingInk" xmlns:wne="http://schemas.microsoft.com/office/word/2006/wordml" xmlns:wps="http://schemas.microsoft.com/office/word/2010/wordprocessingShape" mc:Ignorable="w14 w15 w16se w16cid w16 w16cex w16sdtdh w16sdtfl w16du wp14">
+<w:ftr xmlns:wpc="http://schemas.microsoft.com/office/word/2010/wordprocessingCanvas" xmlns:cx="http://schemas.microsoft.com/office/drawing/2014/chartex" xmlns:cx1="http://schemas.microsoft.com/office/drawing/2015/9/8/chartex" xmlns:cx2="http://schemas.microsoft.com/office/drawing/2015/10/21/chartex" xmlns:cx3="http://schemas.microsoft.com/office/drawing/2016/5/9/chartex" xmlns:cx4="http://schemas.microsoft.com/office/drawing/2016/5/10/chartex" xmlns:cx5="http://schemas.microsoft.com/office/drawing/2016/5/11/chartex" xmlns:cx6="http://schemas.microsoft.com/office/drawing/2016/5/12/chartex" xmlns:cx7="http://schemas.microsoft.com/office/drawing/2016/5/13/chartex" xmlns:cx8="http://schemas.microsoft.com/office/drawing/2016/5/14/chartex" xmlns:mc="http://schemas.openxmlformats.org/markup-compatibility/2006" xmlns:aink="http://schemas.microsoft.com/office/drawing/2016/ink" xmlns:am3d="http://schemas.microsoft.com/office/drawing/2017/model3d" xmlns:o="urn:schemas-microsoft-com:office:office" xmlns:oel="http://schemas.microsoft.com/office/2019/extlst" xmlns:r="http://schemas.openxmlformats.org/officeDocument/2006/relationships" xmlns:m="http://schemas.openxmlformats.org/officeDocument/2006/math" xmlns:v="urn:schemas-microsoft-com:vml" xmlns:wp14="http://schemas.microsoft.com/office/word/2010/wordprocessingDrawing" xmlns:wp="http://schemas.openxmlformats.org/drawingml/2006/wordprocessingDrawing" xmlns:w10="urn:schemas-microsoft-com:office:word" xmlns:w="http://schemas.openxmlformats.org/wordprocessingml/2006/main" xmlns:w14="http://schemas.microsoft.com/office/word/2010/wordml" xmlns:w15="http://schemas.microsoft.com/office/word/2012/wordml" xmlns:w16cei="http://schemas.microsoft.com/office/word/2026/wordml/cei" xmlns:w16cex="http://schemas.microsoft.com/office/word/2018/wordml/cex" xmlns:w16cid="http://schemas.microsoft.com/office/word/2016/wordml/cid" xmlns:w16="http://schemas.microsoft.com/office/word/2018/wordml" xmlns:w16du="http://schemas.microsoft.com/office/word/2023/wordml/word16du" xmlns:w16sdtdh="http://schemas.microsoft.com/office/word/2020/wordml/sdtdatahash" xmlns:w16sdtfl="http://schemas.microsoft.com/office/word/2024/wordml/sdtformatlock" xmlns:w16se="http://schemas.microsoft.com/office/word/2015/wordml/symex" xmlns:wpg="http://schemas.microsoft.com/office/word/2010/wordprocessingGroup" xmlns:wpi="http://schemas.microsoft.com/office/word/2010/wordprocessingInk" xmlns:wne="http://schemas.microsoft.com/office/word/2006/wordml" xmlns:wps="http://schemas.microsoft.com/office/word/2010/wordprocessingShape" mc:Ignorable="w14 w15 w16se w16cid w16 w16cex w16sdtdh w16sdtfl w16du wp14">
   <w:p>
     <w:pPr>
       <w:pBdr>
@@ -29858,7 +30717,7 @@
 </file>
 
 <file path=word/footnotes.xml><?xml version="1.0" encoding="utf-8"?>
-<w:footnotes xmlns:wpc="http://schemas.microsoft.com/office/word/2010/wordprocessingCanvas" xmlns:cx="http://schemas.microsoft.com/office/drawing/2014/chartex" xmlns:cx1="http://schemas.microsoft.com/office/drawing/2015/9/8/chartex" xmlns:cx2="http://schemas.microsoft.com/office/drawing/2015/10/21/chartex" xmlns:cx3="http://schemas.microsoft.com/office/drawing/2016/5/9/chartex" xmlns:cx4="http://schemas.microsoft.com/office/drawing/2016/5/10/chartex" xmlns:cx5="http://schemas.microsoft.com/office/drawing/2016/5/11/chartex" xmlns:cx6="http://schemas.microsoft.com/office/drawing/2016/5/12/chartex" xmlns:cx7="http://schemas.microsoft.com/office/drawing/2016/5/13/chartex" xmlns:cx8="http://schemas.microsoft.com/office/drawing/2016/5/14/chartex" xmlns:mc="http://schemas.openxmlformats.org/markup-compatibility/2006" xmlns:aink="http://schemas.microsoft.com/office/drawing/2016/ink" xmlns:am3d="http://schemas.microsoft.com/office/drawing/2017/model3d" xmlns:o="urn:schemas-microsoft-com:office:office" xmlns:oel="http://schemas.microsoft.com/office/2019/extlst" xmlns:r="http://schemas.openxmlformats.org/officeDocument/2006/relationships" xmlns:m="http://schemas.openxmlformats.org/officeDocument/2006/math" xmlns:v="urn:schemas-microsoft-com:vml" xmlns:wp14="http://schemas.microsoft.com/office/word/2010/wordprocessingDrawing" xmlns:wp="http://schemas.openxmlformats.org/drawingml/2006/wordprocessingDrawing" xmlns:w10="urn:schemas-microsoft-com:office:word" xmlns:w="http://schemas.openxmlformats.org/wordprocessingml/2006/main" xmlns:w14="http://schemas.microsoft.com/office/word/2010/wordml" xmlns:w15="http://schemas.microsoft.com/office/word/2012/wordml" xmlns:w16cex="http://schemas.microsoft.com/office/word/2018/wordml/cex" xmlns:w16cid="http://schemas.microsoft.com/office/word/2016/wordml/cid" xmlns:w16="http://schemas.microsoft.com/office/word/2018/wordml" xmlns:w16du="http://schemas.microsoft.com/office/word/2023/wordml/word16du" xmlns:w16sdtdh="http://schemas.microsoft.com/office/word/2020/wordml/sdtdatahash" xmlns:w16sdtfl="http://schemas.microsoft.com/office/word/2024/wordml/sdtformatlock" xmlns:w16se="http://schemas.microsoft.com/office/word/2015/wordml/symex" xmlns:wpg="http://schemas.microsoft.com/office/word/2010/wordprocessingGroup" xmlns:wpi="http://schemas.microsoft.com/office/word/2010/wordprocessingInk" xmlns:wne="http://schemas.microsoft.com/office/word/2006/wordml" xmlns:wps="http://schemas.microsoft.com/office/word/2010/wordprocessingShape" mc:Ignorable="w14 w15 w16se w16cid w16 w16cex w16sdtdh w16sdtfl w16du wp14">
+<w:footnotes xmlns:wpc="http://schemas.microsoft.com/office/word/2010/wordprocessingCanvas" xmlns:cx="http://schemas.microsoft.com/office/drawing/2014/chartex" xmlns:cx1="http://schemas.microsoft.com/office/drawing/2015/9/8/chartex" xmlns:cx2="http://schemas.microsoft.com/office/drawing/2015/10/21/chartex" xmlns:cx3="http://schemas.microsoft.com/office/drawing/2016/5/9/chartex" xmlns:cx4="http://schemas.microsoft.com/office/drawing/2016/5/10/chartex" xmlns:cx5="http://schemas.microsoft.com/office/drawing/2016/5/11/chartex" xmlns:cx6="http://schemas.microsoft.com/office/drawing/2016/5/12/chartex" xmlns:cx7="http://schemas.microsoft.com/office/drawing/2016/5/13/chartex" xmlns:cx8="http://schemas.microsoft.com/office/drawing/2016/5/14/chartex" xmlns:mc="http://schemas.openxmlformats.org/markup-compatibility/2006" xmlns:aink="http://schemas.microsoft.com/office/drawing/2016/ink" xmlns:am3d="http://schemas.microsoft.com/office/drawing/2017/model3d" xmlns:o="urn:schemas-microsoft-com:office:office" xmlns:oel="http://schemas.microsoft.com/office/2019/extlst" xmlns:r="http://schemas.openxmlformats.org/officeDocument/2006/relationships" xmlns:m="http://schemas.openxmlformats.org/officeDocument/2006/math" xmlns:v="urn:schemas-microsoft-com:vml" xmlns:wp14="http://schemas.microsoft.com/office/word/2010/wordprocessingDrawing" xmlns:wp="http://schemas.openxmlformats.org/drawingml/2006/wordprocessingDrawing" xmlns:w10="urn:schemas-microsoft-com:office:word" xmlns:w="http://schemas.openxmlformats.org/wordprocessingml/2006/main" xmlns:w14="http://schemas.microsoft.com/office/word/2010/wordml" xmlns:w15="http://schemas.microsoft.com/office/word/2012/wordml" xmlns:w16cei="http://schemas.microsoft.com/office/word/2026/wordml/cei" xmlns:w16cex="http://schemas.microsoft.com/office/word/2018/wordml/cex" xmlns:w16cid="http://schemas.microsoft.com/office/word/2016/wordml/cid" xmlns:w16="http://schemas.microsoft.com/office/word/2018/wordml" xmlns:w16du="http://schemas.microsoft.com/office/word/2023/wordml/word16du" xmlns:w16sdtdh="http://schemas.microsoft.com/office/word/2020/wordml/sdtdatahash" xmlns:w16sdtfl="http://schemas.microsoft.com/office/word/2024/wordml/sdtformatlock" xmlns:w16se="http://schemas.microsoft.com/office/word/2015/wordml/symex" xmlns:wpg="http://schemas.microsoft.com/office/word/2010/wordprocessingGroup" xmlns:wpi="http://schemas.microsoft.com/office/word/2010/wordprocessingInk" xmlns:wne="http://schemas.microsoft.com/office/word/2006/wordml" xmlns:wps="http://schemas.microsoft.com/office/word/2010/wordprocessingShape" mc:Ignorable="w14 w15 w16se w16cid w16 w16cex w16sdtdh w16sdtfl w16du wp14">
   <w:footnote w:type="separator" w:id="-1">
     <w:p>
       <w:pPr>
@@ -29883,7 +30742,7 @@
 </file>
 
 <file path=word/header1.xml><?xml version="1.0" encoding="utf-8"?>
-<w:hdr xmlns:wpc="http://schemas.microsoft.com/office/word/2010/wordprocessingCanvas" xmlns:cx="http://schemas.microsoft.com/office/drawing/2014/chartex" xmlns:cx1="http://schemas.microsoft.com/office/drawing/2015/9/8/chartex" xmlns:cx2="http://schemas.microsoft.com/office/drawing/2015/10/21/chartex" xmlns:cx3="http://schemas.microsoft.com/office/drawing/2016/5/9/chartex" xmlns:cx4="http://schemas.microsoft.com/office/drawing/2016/5/10/chartex" xmlns:cx5="http://schemas.microsoft.com/office/drawing/2016/5/11/chartex" xmlns:cx6="http://schemas.microsoft.com/office/drawing/2016/5/12/chartex" xmlns:cx7="http://schemas.microsoft.com/office/drawing/2016/5/13/chartex" xmlns:cx8="http://schemas.microsoft.com/office/drawing/2016/5/14/chartex" xmlns:mc="http://schemas.openxmlformats.org/markup-compatibility/2006" xmlns:aink="http://schemas.microsoft.com/office/drawing/2016/ink" xmlns:am3d="http://schemas.microsoft.com/office/drawing/2017/model3d" xmlns:o="urn:schemas-microsoft-com:office:office" xmlns:oel="http://schemas.microsoft.com/office/2019/extlst" xmlns:r="http://schemas.openxmlformats.org/officeDocument/2006/relationships" xmlns:m="http://schemas.openxmlformats.org/officeDocument/2006/math" xmlns:v="urn:schemas-microsoft-com:vml" xmlns:wp14="http://schemas.microsoft.com/office/word/2010/wordprocessingDrawing" xmlns:wp="http://schemas.openxmlformats.org/drawingml/2006/wordprocessingDrawing" xmlns:w10="urn:schemas-microsoft-com:office:word" xmlns:w="http://schemas.openxmlformats.org/wordprocessingml/2006/main" xmlns:w14="http://schemas.microsoft.com/office/word/2010/wordml" xmlns:w15="http://schemas.microsoft.com/office/word/2012/wordml" xmlns:w16cex="http://schemas.microsoft.com/office/word/2018/wordml/cex" xmlns:w16cid="http://schemas.microsoft.com/office/word/2016/wordml/cid" xmlns:w16="http://schemas.microsoft.com/office/word/2018/wordml" xmlns:w16du="http://schemas.microsoft.com/office/word/2023/wordml/word16du" xmlns:w16sdtdh="http://schemas.microsoft.com/office/word/2020/wordml/sdtdatahash" xmlns:w16sdtfl="http://schemas.microsoft.com/office/word/2024/wordml/sdtformatlock" xmlns:w16se="http://schemas.microsoft.com/office/word/2015/wordml/symex" xmlns:wpg="http://schemas.microsoft.com/office/word/2010/wordprocessingGroup" xmlns:wpi="http://schemas.microsoft.com/office/word/2010/wordprocessingInk" xmlns:wne="http://schemas.microsoft.com/office/word/2006/wordml" xmlns:wps="http://schemas.microsoft.com/office/word/2010/wordprocessingShape" mc:Ignorable="w14 w15 w16se w16cid w16 w16cex w16sdtdh w16sdtfl w16du wp14">
+<w:hdr xmlns:wpc="http://schemas.microsoft.com/office/word/2010/wordprocessingCanvas" xmlns:cx="http://schemas.microsoft.com/office/drawing/2014/chartex" xmlns:cx1="http://schemas.microsoft.com/office/drawing/2015/9/8/chartex" xmlns:cx2="http://schemas.microsoft.com/office/drawing/2015/10/21/chartex" xmlns:cx3="http://schemas.microsoft.com/office/drawing/2016/5/9/chartex" xmlns:cx4="http://schemas.microsoft.com/office/drawing/2016/5/10/chartex" xmlns:cx5="http://schemas.microsoft.com/office/drawing/2016/5/11/chartex" xmlns:cx6="http://schemas.microsoft.com/office/drawing/2016/5/12/chartex" xmlns:cx7="http://schemas.microsoft.com/office/drawing/2016/5/13/chartex" xmlns:cx8="http://schemas.microsoft.com/office/drawing/2016/5/14/chartex" xmlns:mc="http://schemas.openxmlformats.org/markup-compatibility/2006" xmlns:aink="http://schemas.microsoft.com/office/drawing/2016/ink" xmlns:am3d="http://schemas.microsoft.com/office/drawing/2017/model3d" xmlns:o="urn:schemas-microsoft-com:office:office" xmlns:oel="http://schemas.microsoft.com/office/2019/extlst" xmlns:r="http://schemas.openxmlformats.org/officeDocument/2006/relationships" xmlns:m="http://schemas.openxmlformats.org/officeDocument/2006/math" xmlns:v="urn:schemas-microsoft-com:vml" xmlns:wp14="http://schemas.microsoft.com/office/word/2010/wordprocessingDrawing" xmlns:wp="http://schemas.openxmlformats.org/drawingml/2006/wordprocessingDrawing" xmlns:w10="urn:schemas-microsoft-com:office:word" xmlns:w="http://schemas.openxmlformats.org/wordprocessingml/2006/main" xmlns:w14="http://schemas.microsoft.com/office/word/2010/wordml" xmlns:w15="http://schemas.microsoft.com/office/word/2012/wordml" xmlns:w16cei="http://schemas.microsoft.com/office/word/2026/wordml/cei" xmlns:w16cex="http://schemas.microsoft.com/office/word/2018/wordml/cex" xmlns:w16cid="http://schemas.microsoft.com/office/word/2016/wordml/cid" xmlns:w16="http://schemas.microsoft.com/office/word/2018/wordml" xmlns:w16du="http://schemas.microsoft.com/office/word/2023/wordml/word16du" xmlns:w16sdtdh="http://schemas.microsoft.com/office/word/2020/wordml/sdtdatahash" xmlns:w16sdtfl="http://schemas.microsoft.com/office/word/2024/wordml/sdtformatlock" xmlns:w16se="http://schemas.microsoft.com/office/word/2015/wordml/symex" xmlns:wpg="http://schemas.microsoft.com/office/word/2010/wordprocessingGroup" xmlns:wpi="http://schemas.microsoft.com/office/word/2010/wordprocessingInk" xmlns:wne="http://schemas.microsoft.com/office/word/2006/wordml" xmlns:wps="http://schemas.microsoft.com/office/word/2010/wordprocessingShape" mc:Ignorable="w14 w15 w16se w16cid w16 w16cex w16sdtdh w16sdtfl w16du wp14">
   <w:p>
     <w:pPr>
       <w:pStyle w:val="Header"/>
@@ -29904,7 +30763,7 @@
 </file>
 
 <file path=word/header2.xml><?xml version="1.0" encoding="utf-8"?>
-<w:hdr xmlns:wpc="http://schemas.microsoft.com/office/word/2010/wordprocessingCanvas" xmlns:cx="http://schemas.microsoft.com/office/drawing/2014/chartex" xmlns:cx1="http://schemas.microsoft.com/office/drawing/2015/9/8/chartex" xmlns:cx2="http://schemas.microsoft.com/office/drawing/2015/10/21/chartex" xmlns:cx3="http://schemas.microsoft.com/office/drawing/2016/5/9/chartex" xmlns:cx4="http://schemas.microsoft.com/office/drawing/2016/5/10/chartex" xmlns:cx5="http://schemas.microsoft.com/office/drawing/2016/5/11/chartex" xmlns:cx6="http://schemas.microsoft.com/office/drawing/2016/5/12/chartex" xmlns:cx7="http://schemas.microsoft.com/office/drawing/2016/5/13/chartex" xmlns:cx8="http://schemas.microsoft.com/office/drawing/2016/5/14/chartex" xmlns:mc="http://schemas.openxmlformats.org/markup-compatibility/2006" xmlns:aink="http://schemas.microsoft.com/office/drawing/2016/ink" xmlns:am3d="http://schemas.microsoft.com/office/drawing/2017/model3d" xmlns:o="urn:schemas-microsoft-com:office:office" xmlns:oel="http://schemas.microsoft.com/office/2019/extlst" xmlns:r="http://schemas.openxmlformats.org/officeDocument/2006/relationships" xmlns:m="http://schemas.openxmlformats.org/officeDocument/2006/math" xmlns:v="urn:schemas-microsoft-com:vml" xmlns:wp14="http://schemas.microsoft.com/office/word/2010/wordprocessingDrawing" xmlns:wp="http://schemas.openxmlformats.org/drawingml/2006/wordprocessingDrawing" xmlns:w10="urn:schemas-microsoft-com:office:word" xmlns:w="http://schemas.openxmlformats.org/wordprocessingml/2006/main" xmlns:w14="http://schemas.microsoft.com/office/word/2010/wordml" xmlns:w15="http://schemas.microsoft.com/office/word/2012/wordml" xmlns:w16cex="http://schemas.microsoft.com/office/word/2018/wordml/cex" xmlns:w16cid="http://schemas.microsoft.com/office/word/2016/wordml/cid" xmlns:w16="http://schemas.microsoft.com/office/word/2018/wordml" xmlns:w16du="http://schemas.microsoft.com/office/word/2023/wordml/word16du" xmlns:w16sdtdh="http://schemas.microsoft.com/office/word/2020/wordml/sdtdatahash" xmlns:w16sdtfl="http://schemas.microsoft.com/office/word/2024/wordml/sdtformatlock" xmlns:w16se="http://schemas.microsoft.com/office/word/2015/wordml/symex" xmlns:wpg="http://schemas.microsoft.com/office/word/2010/wordprocessingGroup" xmlns:wpi="http://schemas.microsoft.com/office/word/2010/wordprocessingInk" xmlns:wne="http://schemas.microsoft.com/office/word/2006/wordml" xmlns:wps="http://schemas.microsoft.com/office/word/2010/wordprocessingShape" mc:Ignorable="w14 w15 w16se w16cid w16 w16cex w16sdtdh w16sdtfl w16du wp14">
+<w:hdr xmlns:wpc="http://schemas.microsoft.com/office/word/2010/wordprocessingCanvas" xmlns:cx="http://schemas.microsoft.com/office/drawing/2014/chartex" xmlns:cx1="http://schemas.microsoft.com/office/drawing/2015/9/8/chartex" xmlns:cx2="http://schemas.microsoft.com/office/drawing/2015/10/21/chartex" xmlns:cx3="http://schemas.microsoft.com/office/drawing/2016/5/9/chartex" xmlns:cx4="http://schemas.microsoft.com/office/drawing/2016/5/10/chartex" xmlns:cx5="http://schemas.microsoft.com/office/drawing/2016/5/11/chartex" xmlns:cx6="http://schemas.microsoft.com/office/drawing/2016/5/12/chartex" xmlns:cx7="http://schemas.microsoft.com/office/drawing/2016/5/13/chartex" xmlns:cx8="http://schemas.microsoft.com/office/drawing/2016/5/14/chartex" xmlns:mc="http://schemas.openxmlformats.org/markup-compatibility/2006" xmlns:aink="http://schemas.microsoft.com/office/drawing/2016/ink" xmlns:am3d="http://schemas.microsoft.com/office/drawing/2017/model3d" xmlns:o="urn:schemas-microsoft-com:office:office" xmlns:oel="http://schemas.microsoft.com/office/2019/extlst" xmlns:r="http://schemas.openxmlformats.org/officeDocument/2006/relationships" xmlns:m="http://schemas.openxmlformats.org/officeDocument/2006/math" xmlns:v="urn:schemas-microsoft-com:vml" xmlns:wp14="http://schemas.microsoft.com/office/word/2010/wordprocessingDrawing" xmlns:wp="http://schemas.openxmlformats.org/drawingml/2006/wordprocessingDrawing" xmlns:w10="urn:schemas-microsoft-com:office:word" xmlns:w="http://schemas.openxmlformats.org/wordprocessingml/2006/main" xmlns:w14="http://schemas.microsoft.com/office/word/2010/wordml" xmlns:w15="http://schemas.microsoft.com/office/word/2012/wordml" xmlns:w16cei="http://schemas.microsoft.com/office/word/2026/wordml/cei" xmlns:w16cex="http://schemas.microsoft.com/office/word/2018/wordml/cex" xmlns:w16cid="http://schemas.microsoft.com/office/word/2016/wordml/cid" xmlns:w16="http://schemas.microsoft.com/office/word/2018/wordml" xmlns:w16du="http://schemas.microsoft.com/office/word/2023/wordml/word16du" xmlns:w16sdtdh="http://schemas.microsoft.com/office/word/2020/wordml/sdtdatahash" xmlns:w16sdtfl="http://schemas.microsoft.com/office/word/2024/wordml/sdtformatlock" xmlns:w16se="http://schemas.microsoft.com/office/word/2015/wordml/symex" xmlns:wpg="http://schemas.microsoft.com/office/word/2010/wordprocessingGroup" xmlns:wpi="http://schemas.microsoft.com/office/word/2010/wordprocessingInk" xmlns:wne="http://schemas.microsoft.com/office/word/2006/wordml" xmlns:wps="http://schemas.microsoft.com/office/word/2010/wordprocessingShape" mc:Ignorable="w14 w15 w16se w16cid w16 w16cex w16sdtdh w16sdtfl w16du wp14">
   <w:p>
     <w:pPr>
       <w:pStyle w:val="Header"/>

</xml_diff>